<commit_message>
fix: remove AI disclosure section from AURIS paper
</commit_message>
<xml_diff>
--- a/docs/academic/paper/AURIS_paper_GUJSA.docx
+++ b/docs/academic/paper/AURIS_paper_GUJSA.docx
@@ -8054,38 +8054,6 @@
           <w:i w:val="0"/>
           <w:sz w:val="22"/>
         </w:rPr>
-        <w:t>AI DISCLOSURE</w:t>
-      </w:r>
-    </w:p>
-    <w:p>
-      <w:pPr>
-        <w:jc w:val="both"/>
-        <w:spacing w:before="80" w:after="160" w:line="240" w:lineRule="auto"/>
-      </w:pPr>
-      <w:r>
-        <w:rPr>
-          <w:rFonts w:ascii="Times New Roman" w:hAnsi="Times New Roman" w:cs="Times New Roman"/>
-          <w:rFonts w:ascii="Times New Roman" w:hAnsi="Times New Roman"/>
-          <w:b w:val="0"/>
-          <w:i w:val="0"/>
-          <w:sz w:val="22"/>
-        </w:rPr>
-        <w:t>Portions of the code implementation and manuscript drafting were assisted by Claude (Anthropic), an AI language model. All experimental design, dataset curation, model evaluation, interpretation of results, and final editorial decisions were made by the author. This disclosure is provided in accordance with the journal's AI use policy.</w:t>
-      </w:r>
-    </w:p>
-    <w:p>
-      <w:pPr>
-        <w:jc w:val="left"/>
-        <w:spacing w:before="280" w:after="120" w:line="240" w:lineRule="auto"/>
-      </w:pPr>
-      <w:r>
-        <w:rPr>
-          <w:rFonts w:ascii="Times New Roman" w:hAnsi="Times New Roman" w:cs="Times New Roman"/>
-          <w:rFonts w:ascii="Times New Roman" w:hAnsi="Times New Roman"/>
-          <w:b/>
-          <w:i w:val="0"/>
-          <w:sz w:val="22"/>
-        </w:rPr>
         <w:t>ACKNOWLEDGEMENT</w:t>
       </w:r>
     </w:p>

</xml_diff>

<commit_message>
feat: enhance document formatting with paragraph control functions and improved figure handling
</commit_message>
<xml_diff>
--- a/docs/academic/paper/AURIS_paper_GUJSA.docx
+++ b/docs/academic/paper/AURIS_paper_GUJSA.docx
@@ -296,6 +296,8 @@
       <w:pPr>
         <w:jc w:val="left"/>
         <w:spacing w:before="280" w:after="120" w:line="240" w:lineRule="auto"/>
+        <w:keepNext/>
+        <w:keepLines/>
       </w:pPr>
       <w:r>
         <w:rPr>
@@ -443,6 +445,8 @@
       <w:pPr>
         <w:jc w:val="center"/>
         <w:spacing w:before="160" w:after="40" w:line="240" w:lineRule="auto"/>
+        <w:keepNext/>
+        <w:keepLines/>
       </w:pPr>
       <w:r>
         <w:drawing>
@@ -483,6 +487,7 @@
       <w:pPr>
         <w:jc w:val="center"/>
         <w:spacing w:before="80" w:after="240" w:line="240" w:lineRule="auto"/>
+        <w:keepLines/>
       </w:pPr>
       <w:r>
         <w:rPr>
@@ -499,6 +504,8 @@
       <w:pPr>
         <w:jc w:val="left"/>
         <w:spacing w:before="280" w:after="120" w:line="240" w:lineRule="auto"/>
+        <w:keepNext/>
+        <w:keepLines/>
       </w:pPr>
       <w:r>
         <w:rPr>
@@ -515,6 +522,8 @@
       <w:pPr>
         <w:jc w:val="left"/>
         <w:spacing w:before="200" w:after="80" w:line="240" w:lineRule="auto"/>
+        <w:keepNext/>
+        <w:keepLines/>
       </w:pPr>
       <w:r>
         <w:rPr>
@@ -547,6 +556,8 @@
       <w:pPr>
         <w:jc w:val="left"/>
         <w:spacing w:before="200" w:after="80" w:line="240" w:lineRule="auto"/>
+        <w:keepNext/>
+        <w:keepLines/>
       </w:pPr>
       <w:r>
         <w:rPr>
@@ -579,6 +590,8 @@
       <w:pPr>
         <w:jc w:val="left"/>
         <w:spacing w:before="200" w:after="80" w:line="240" w:lineRule="auto"/>
+        <w:keepNext/>
+        <w:keepLines/>
       </w:pPr>
       <w:r>
         <w:rPr>
@@ -611,6 +624,8 @@
       <w:pPr>
         <w:jc w:val="left"/>
         <w:spacing w:before="200" w:after="80" w:line="240" w:lineRule="auto"/>
+        <w:keepNext/>
+        <w:keepLines/>
       </w:pPr>
       <w:r>
         <w:rPr>
@@ -643,6 +658,8 @@
       <w:pPr>
         <w:jc w:val="left"/>
         <w:spacing w:before="200" w:after="80" w:line="240" w:lineRule="auto"/>
+        <w:keepNext/>
+        <w:keepLines/>
       </w:pPr>
       <w:r>
         <w:rPr>
@@ -675,6 +692,8 @@
       <w:pPr>
         <w:jc w:val="left"/>
         <w:spacing w:before="280" w:after="120" w:line="240" w:lineRule="auto"/>
+        <w:keepNext/>
+        <w:keepLines/>
       </w:pPr>
       <w:r>
         <w:rPr>
@@ -691,6 +710,8 @@
       <w:pPr>
         <w:jc w:val="left"/>
         <w:spacing w:before="200" w:after="80" w:line="240" w:lineRule="auto"/>
+        <w:keepNext/>
+        <w:keepLines/>
       </w:pPr>
       <w:r>
         <w:rPr>
@@ -1456,6 +1477,7 @@
       <w:pPr>
         <w:jc w:val="center"/>
         <w:spacing w:before="80" w:after="240" w:line="240" w:lineRule="auto"/>
+        <w:keepLines/>
       </w:pPr>
       <w:r>
         <w:rPr>
@@ -1472,6 +1494,8 @@
       <w:pPr>
         <w:jc w:val="center"/>
         <w:spacing w:before="160" w:after="40" w:line="240" w:lineRule="auto"/>
+        <w:keepNext/>
+        <w:keepLines/>
       </w:pPr>
       <w:r>
         <w:drawing>
@@ -1512,6 +1536,7 @@
       <w:pPr>
         <w:jc w:val="center"/>
         <w:spacing w:before="80" w:after="240" w:line="240" w:lineRule="auto"/>
+        <w:keepLines/>
       </w:pPr>
       <w:r>
         <w:rPr>
@@ -1528,6 +1553,8 @@
       <w:pPr>
         <w:jc w:val="left"/>
         <w:spacing w:before="200" w:after="80" w:line="240" w:lineRule="auto"/>
+        <w:keepNext/>
+        <w:keepLines/>
       </w:pPr>
       <w:r>
         <w:rPr>
@@ -1576,6 +1603,8 @@
       <w:pPr>
         <w:jc w:val="left"/>
         <w:spacing w:before="200" w:after="80" w:line="240" w:lineRule="auto"/>
+        <w:keepNext/>
+        <w:keepLines/>
       </w:pPr>
       <w:r>
         <w:rPr>
@@ -2452,6 +2481,7 @@
       <w:pPr>
         <w:jc w:val="center"/>
         <w:spacing w:before="80" w:after="240" w:line="240" w:lineRule="auto"/>
+        <w:keepLines/>
       </w:pPr>
       <w:r>
         <w:rPr>
@@ -2468,6 +2498,8 @@
       <w:pPr>
         <w:jc w:val="left"/>
         <w:spacing w:before="200" w:after="80" w:line="240" w:lineRule="auto"/>
+        <w:keepNext/>
+        <w:keepLines/>
       </w:pPr>
       <w:r>
         <w:rPr>
@@ -2500,6 +2532,7 @@
       <w:pPr>
         <w:jc w:val="center"/>
         <w:spacing w:before="120" w:after="120" w:line="240" w:lineRule="auto"/>
+        <w:keepLines/>
       </w:pPr>
       <w:r>
         <w:rPr>
@@ -2803,6 +2836,8 @@
       <w:pPr>
         <w:jc w:val="center"/>
         <w:spacing w:before="160" w:after="40" w:line="240" w:lineRule="auto"/>
+        <w:keepNext/>
+        <w:keepLines/>
       </w:pPr>
       <w:r>
         <w:drawing>
@@ -2843,6 +2878,7 @@
       <w:pPr>
         <w:jc w:val="center"/>
         <w:spacing w:before="80" w:after="240" w:line="240" w:lineRule="auto"/>
+        <w:keepLines/>
       </w:pPr>
       <w:r>
         <w:rPr>
@@ -2859,6 +2895,8 @@
       <w:pPr>
         <w:jc w:val="left"/>
         <w:spacing w:before="280" w:after="120" w:line="240" w:lineRule="auto"/>
+        <w:keepNext/>
+        <w:keepLines/>
       </w:pPr>
       <w:r>
         <w:rPr>
@@ -2875,6 +2913,8 @@
       <w:pPr>
         <w:jc w:val="left"/>
         <w:spacing w:before="200" w:after="80" w:line="240" w:lineRule="auto"/>
+        <w:keepNext/>
+        <w:keepLines/>
       </w:pPr>
       <w:r>
         <w:rPr>
@@ -4795,6 +4835,7 @@
       <w:pPr>
         <w:jc w:val="center"/>
         <w:spacing w:before="80" w:after="240" w:line="240" w:lineRule="auto"/>
+        <w:keepLines/>
       </w:pPr>
       <w:r>
         <w:rPr>
@@ -4811,6 +4852,8 @@
       <w:pPr>
         <w:jc w:val="center"/>
         <w:spacing w:before="160" w:after="40" w:line="240" w:lineRule="auto"/>
+        <w:keepNext/>
+        <w:keepLines/>
       </w:pPr>
       <w:r>
         <w:drawing>
@@ -4851,6 +4894,7 @@
       <w:pPr>
         <w:jc w:val="center"/>
         <w:spacing w:before="80" w:after="240" w:line="240" w:lineRule="auto"/>
+        <w:keepLines/>
       </w:pPr>
       <w:r>
         <w:rPr>
@@ -4867,6 +4911,8 @@
       <w:pPr>
         <w:jc w:val="center"/>
         <w:spacing w:before="160" w:after="40" w:line="240" w:lineRule="auto"/>
+        <w:keepNext/>
+        <w:keepLines/>
       </w:pPr>
       <w:r>
         <w:drawing>
@@ -4907,6 +4953,7 @@
       <w:pPr>
         <w:jc w:val="center"/>
         <w:spacing w:before="80" w:after="240" w:line="240" w:lineRule="auto"/>
+        <w:keepLines/>
       </w:pPr>
       <w:r>
         <w:rPr>
@@ -4923,6 +4970,8 @@
       <w:pPr>
         <w:jc w:val="center"/>
         <w:spacing w:before="160" w:after="40" w:line="240" w:lineRule="auto"/>
+        <w:keepNext/>
+        <w:keepLines/>
       </w:pPr>
       <w:r>
         <w:drawing>
@@ -4963,6 +5012,7 @@
       <w:pPr>
         <w:jc w:val="center"/>
         <w:spacing w:before="80" w:after="240" w:line="240" w:lineRule="auto"/>
+        <w:keepLines/>
       </w:pPr>
       <w:r>
         <w:rPr>
@@ -4979,6 +5029,8 @@
       <w:pPr>
         <w:jc w:val="left"/>
         <w:spacing w:before="200" w:after="80" w:line="240" w:lineRule="auto"/>
+        <w:keepNext/>
+        <w:keepLines/>
       </w:pPr>
       <w:r>
         <w:rPr>
@@ -5011,6 +5063,8 @@
       <w:pPr>
         <w:jc w:val="center"/>
         <w:spacing w:before="160" w:after="40" w:line="240" w:lineRule="auto"/>
+        <w:keepNext/>
+        <w:keepLines/>
       </w:pPr>
       <w:r>
         <w:drawing>
@@ -5051,6 +5105,7 @@
       <w:pPr>
         <w:jc w:val="center"/>
         <w:spacing w:before="80" w:after="240" w:line="240" w:lineRule="auto"/>
+        <w:keepLines/>
       </w:pPr>
       <w:r>
         <w:rPr>
@@ -5067,6 +5122,8 @@
       <w:pPr>
         <w:jc w:val="left"/>
         <w:spacing w:before="200" w:after="80" w:line="240" w:lineRule="auto"/>
+        <w:keepNext/>
+        <w:keepLines/>
       </w:pPr>
       <w:r>
         <w:rPr>
@@ -6006,6 +6063,7 @@
       <w:pPr>
         <w:jc w:val="center"/>
         <w:spacing w:before="80" w:after="240" w:line="240" w:lineRule="auto"/>
+        <w:keepLines/>
       </w:pPr>
       <w:r>
         <w:rPr>
@@ -6022,6 +6080,8 @@
       <w:pPr>
         <w:jc w:val="center"/>
         <w:spacing w:before="160" w:after="40" w:line="240" w:lineRule="auto"/>
+        <w:keepNext/>
+        <w:keepLines/>
       </w:pPr>
       <w:r>
         <w:drawing>
@@ -6062,6 +6122,7 @@
       <w:pPr>
         <w:jc w:val="center"/>
         <w:spacing w:before="80" w:after="240" w:line="240" w:lineRule="auto"/>
+        <w:keepLines/>
       </w:pPr>
       <w:r>
         <w:rPr>
@@ -6078,6 +6139,8 @@
       <w:pPr>
         <w:jc w:val="left"/>
         <w:spacing w:before="200" w:after="80" w:line="240" w:lineRule="auto"/>
+        <w:keepNext/>
+        <w:keepLines/>
       </w:pPr>
       <w:r>
         <w:rPr>
@@ -7113,6 +7176,7 @@
       <w:pPr>
         <w:jc w:val="center"/>
         <w:spacing w:before="80" w:after="240" w:line="240" w:lineRule="auto"/>
+        <w:keepLines/>
       </w:pPr>
       <w:r>
         <w:rPr>
@@ -7129,6 +7193,8 @@
       <w:pPr>
         <w:jc w:val="center"/>
         <w:spacing w:before="160" w:after="40" w:line="240" w:lineRule="auto"/>
+        <w:keepNext/>
+        <w:keepLines/>
       </w:pPr>
       <w:r>
         <w:drawing>
@@ -7169,6 +7235,7 @@
       <w:pPr>
         <w:jc w:val="center"/>
         <w:spacing w:before="80" w:after="240" w:line="240" w:lineRule="auto"/>
+        <w:keepLines/>
       </w:pPr>
       <w:r>
         <w:rPr>
@@ -7185,6 +7252,8 @@
       <w:pPr>
         <w:jc w:val="center"/>
         <w:spacing w:before="160" w:after="40" w:line="240" w:lineRule="auto"/>
+        <w:keepNext/>
+        <w:keepLines/>
       </w:pPr>
       <w:r>
         <w:drawing>
@@ -7225,6 +7294,7 @@
       <w:pPr>
         <w:jc w:val="center"/>
         <w:spacing w:before="80" w:after="240" w:line="240" w:lineRule="auto"/>
+        <w:keepLines/>
       </w:pPr>
       <w:r>
         <w:rPr>
@@ -7241,6 +7311,8 @@
       <w:pPr>
         <w:jc w:val="left"/>
         <w:spacing w:before="200" w:after="80" w:line="240" w:lineRule="auto"/>
+        <w:keepNext/>
+        <w:keepLines/>
       </w:pPr>
       <w:r>
         <w:rPr>
@@ -7273,6 +7345,8 @@
       <w:pPr>
         <w:jc w:val="center"/>
         <w:spacing w:before="160" w:after="40" w:line="240" w:lineRule="auto"/>
+        <w:keepNext/>
+        <w:keepLines/>
       </w:pPr>
       <w:r>
         <w:drawing>
@@ -7313,6 +7387,7 @@
       <w:pPr>
         <w:jc w:val="center"/>
         <w:spacing w:before="80" w:after="240" w:line="240" w:lineRule="auto"/>
+        <w:keepLines/>
       </w:pPr>
       <w:r>
         <w:rPr>
@@ -7345,6 +7420,7 @@
       <w:pPr>
         <w:jc w:val="center"/>
         <w:spacing w:before="120" w:after="120" w:line="240" w:lineRule="auto"/>
+        <w:keepLines/>
       </w:pPr>
       <w:r>
         <w:rPr>
@@ -7389,6 +7465,8 @@
       <w:pPr>
         <w:jc w:val="center"/>
         <w:spacing w:before="160" w:after="40" w:line="240" w:lineRule="auto"/>
+        <w:keepNext/>
+        <w:keepLines/>
       </w:pPr>
       <w:r>
         <w:drawing>
@@ -7429,6 +7507,7 @@
       <w:pPr>
         <w:jc w:val="center"/>
         <w:spacing w:before="80" w:after="240" w:line="240" w:lineRule="auto"/>
+        <w:keepLines/>
       </w:pPr>
       <w:r>
         <w:rPr>
@@ -7445,6 +7524,8 @@
       <w:pPr>
         <w:jc w:val="center"/>
         <w:spacing w:before="160" w:after="40" w:line="240" w:lineRule="auto"/>
+        <w:keepNext/>
+        <w:keepLines/>
       </w:pPr>
       <w:r>
         <w:drawing>
@@ -7485,6 +7566,7 @@
       <w:pPr>
         <w:jc w:val="center"/>
         <w:spacing w:before="80" w:after="240" w:line="240" w:lineRule="auto"/>
+        <w:keepLines/>
       </w:pPr>
       <w:r>
         <w:rPr>
@@ -7501,6 +7583,8 @@
       <w:pPr>
         <w:jc w:val="center"/>
         <w:spacing w:before="160" w:after="40" w:line="240" w:lineRule="auto"/>
+        <w:keepNext/>
+        <w:keepLines/>
       </w:pPr>
       <w:r>
         <w:drawing>
@@ -7541,6 +7625,7 @@
       <w:pPr>
         <w:jc w:val="center"/>
         <w:spacing w:before="80" w:after="240" w:line="240" w:lineRule="auto"/>
+        <w:keepLines/>
       </w:pPr>
       <w:r>
         <w:rPr>
@@ -7557,6 +7642,8 @@
       <w:pPr>
         <w:jc w:val="left"/>
         <w:spacing w:before="200" w:after="80" w:line="240" w:lineRule="auto"/>
+        <w:keepNext/>
+        <w:keepLines/>
       </w:pPr>
       <w:r>
         <w:rPr>
@@ -7589,6 +7676,8 @@
       <w:pPr>
         <w:jc w:val="center"/>
         <w:spacing w:before="160" w:after="40" w:line="240" w:lineRule="auto"/>
+        <w:keepNext/>
+        <w:keepLines/>
       </w:pPr>
       <w:r>
         <w:drawing>
@@ -7629,6 +7718,7 @@
       <w:pPr>
         <w:jc w:val="center"/>
         <w:spacing w:before="80" w:after="240" w:line="240" w:lineRule="auto"/>
+        <w:keepLines/>
       </w:pPr>
       <w:r>
         <w:rPr>
@@ -7645,6 +7735,8 @@
       <w:pPr>
         <w:jc w:val="left"/>
         <w:spacing w:before="200" w:after="80" w:line="240" w:lineRule="auto"/>
+        <w:keepNext/>
+        <w:keepLines/>
       </w:pPr>
       <w:r>
         <w:rPr>
@@ -7677,6 +7769,8 @@
       <w:pPr>
         <w:jc w:val="center"/>
         <w:spacing w:before="160" w:after="40" w:line="240" w:lineRule="auto"/>
+        <w:keepNext/>
+        <w:keepLines/>
       </w:pPr>
       <w:r>
         <w:drawing>
@@ -7717,6 +7811,7 @@
       <w:pPr>
         <w:jc w:val="center"/>
         <w:spacing w:before="80" w:after="240" w:line="240" w:lineRule="auto"/>
+        <w:keepLines/>
       </w:pPr>
       <w:r>
         <w:rPr>
@@ -7733,6 +7828,8 @@
       <w:pPr>
         <w:jc w:val="center"/>
         <w:spacing w:before="160" w:after="40" w:line="240" w:lineRule="auto"/>
+        <w:keepNext/>
+        <w:keepLines/>
       </w:pPr>
       <w:r>
         <w:drawing>
@@ -7773,6 +7870,7 @@
       <w:pPr>
         <w:jc w:val="center"/>
         <w:spacing w:before="80" w:after="240" w:line="240" w:lineRule="auto"/>
+        <w:keepLines/>
       </w:pPr>
       <w:r>
         <w:rPr>
@@ -7789,6 +7887,8 @@
       <w:pPr>
         <w:jc w:val="left"/>
         <w:spacing w:before="280" w:after="120" w:line="240" w:lineRule="auto"/>
+        <w:keepNext/>
+        <w:keepLines/>
       </w:pPr>
       <w:r>
         <w:rPr>
@@ -7805,6 +7905,8 @@
       <w:pPr>
         <w:jc w:val="left"/>
         <w:spacing w:before="200" w:after="80" w:line="240" w:lineRule="auto"/>
+        <w:keepNext/>
+        <w:keepLines/>
       </w:pPr>
       <w:r>
         <w:rPr>
@@ -7837,6 +7939,8 @@
       <w:pPr>
         <w:jc w:val="left"/>
         <w:spacing w:before="200" w:after="80" w:line="240" w:lineRule="auto"/>
+        <w:keepNext/>
+        <w:keepLines/>
       </w:pPr>
       <w:r>
         <w:rPr>
@@ -7869,6 +7973,8 @@
       <w:pPr>
         <w:jc w:val="left"/>
         <w:spacing w:before="200" w:after="80" w:line="240" w:lineRule="auto"/>
+        <w:keepNext/>
+        <w:keepLines/>
       </w:pPr>
       <w:r>
         <w:rPr>
@@ -7901,6 +8007,8 @@
       <w:pPr>
         <w:jc w:val="left"/>
         <w:spacing w:before="200" w:after="80" w:line="240" w:lineRule="auto"/>
+        <w:keepNext/>
+        <w:keepLines/>
       </w:pPr>
       <w:r>
         <w:rPr>
@@ -7933,6 +8041,8 @@
       <w:pPr>
         <w:jc w:val="left"/>
         <w:spacing w:before="200" w:after="80" w:line="240" w:lineRule="auto"/>
+        <w:keepNext/>
+        <w:keepLines/>
       </w:pPr>
       <w:r>
         <w:rPr>
@@ -7965,6 +8075,8 @@
       <w:pPr>
         <w:jc w:val="left"/>
         <w:spacing w:before="280" w:after="120" w:line="240" w:lineRule="auto"/>
+        <w:keepNext/>
+        <w:keepLines/>
       </w:pPr>
       <w:r>
         <w:rPr>
@@ -8013,6 +8125,8 @@
       <w:pPr>
         <w:jc w:val="left"/>
         <w:spacing w:before="280" w:after="120" w:line="240" w:lineRule="auto"/>
+        <w:keepNext/>
+        <w:keepLines/>
       </w:pPr>
       <w:r>
         <w:rPr>
@@ -8045,6 +8159,8 @@
       <w:pPr>
         <w:jc w:val="left"/>
         <w:spacing w:before="280" w:after="120" w:line="240" w:lineRule="auto"/>
+        <w:keepNext/>
+        <w:keepLines/>
       </w:pPr>
       <w:r>
         <w:rPr>
@@ -8077,6 +8193,8 @@
       <w:pPr>
         <w:jc w:val="left"/>
         <w:spacing w:before="280" w:after="120" w:line="240" w:lineRule="auto"/>
+        <w:keepNext/>
+        <w:keepLines/>
       </w:pPr>
       <w:r>
         <w:rPr>
@@ -8109,6 +8227,8 @@
       <w:pPr>
         <w:jc w:val="left"/>
         <w:spacing w:before="280" w:after="120" w:line="240" w:lineRule="auto"/>
+        <w:keepNext/>
+        <w:keepLines/>
       </w:pPr>
       <w:r>
         <w:rPr>

</xml_diff>

<commit_message>
refactor: update ROC-AUC values for LightGBM and Deep MLP in AURIS_paper_GUJSA.docx for accuracy
</commit_message>
<xml_diff>
--- a/docs/academic/paper/AURIS_paper_GUJSA.docx
+++ b/docs/academic/paper/AURIS_paper_GUJSA.docx
@@ -137,7 +137,7 @@
           <w:i w:val="0"/>
           <w:sz w:val="18"/>
         </w:rPr>
-        <w:t>• LightGBM reaches a mean ROC-AUC of 0.9549; Deep MLP follows closely at 0.9537.</w:t>
+        <w:t>• LightGBM reaches a mean ROC-AUC of 0.9548; Deep MLP follows closely at 0.9542.</w:t>
       </w:r>
     </w:p>
     <w:p>
@@ -203,7 +203,7 @@
           <w:i w:val="0"/>
           <w:sz w:val="18"/>
         </w:rPr>
-        <w:t>Suno, Udio ve MusicGen gibi yapay zeka tabanlı müzik üretim sistemlerinin son birkaç yılda gösterdiği gelişme, yapay zeka tarafından üretilen kayıtların insan tarafından bestelenmiş müzikten ayırt edilmesini hem dinleyiciler hem de otomatik sistemler için giderek güçleştirmiştir. Bu çalışmada akustik öznitelik analizine dayalı çok modelli bir topluluk sistemi olan AURIS önerilmektedir. AURIS, librosa kütüphanesi aracılığıyla spektral, zamansal, ritmik, armonik ve vokal boyutları kapsayan 47 öznitelik çıkarmakta ve bu vektörü 2.082 yapay zeka kaynaklı ve 3.113 insan kaynaklı toplam 5.195 örnekten oluşan veri kümesi üzerinde eğitilen on bir sınıflandırma modeline beslemektedir. Modeller, geleneksel makine öğrenmesi (Lojistik Regresyon, Rastgele Orman, Gradyan Artırma, SVM, ÇKA, XGBoost, LightGBM) ve derin öğrenme (Derin ÇKA, 1B-CNN, Artık ÇKA, Dikkat ÇKA) ailelerinden seçilmiştir. Eğitim süreci, sınıf dengesizliğini hesaba katmak için her katmanda Youden's J istatistiğine dayalı eşik optimizasyonu uygulanan 5-katlı tabakalı çapraz doğrulama protokolünü kullanmaktadır. Deneysel sonuçlar, LightGBM modelinin 0,9549'luk ROC-AUC değeri ile en yüksek performansı sergilediğini, Derin ÇKA modelinin ise 0,9537 ile çok yakın bir ikinci sıra elde ettiğini göstermektedir. LightGBM için Brier skoru 0,083 olarak ölçülmüş, modelin iyi kalibre edilmiş olasılık tahminleri ürettiği teyit edilmiştir. Spektral düzlük (spectral flatness) yapay zeka ile insan müziğini ayırt etmede en belirleyici tekil özellik olarak belirlenmiştir. Sistem, Hugging Face Spaces üzerinde dosya yükleme ve canlı mikrofon girişi yoluyla gerçek zamanlı analiz sunan halka açık bir web uygulaması olarak yayınlanmıştır.</w:t>
+        <w:t>Suno, Udio ve MusicGen gibi yapay zeka tabanlı müzik üretim sistemlerinin son birkaç yılda gösterdiği gelişme, yapay zeka tarafından üretilen kayıtların insan tarafından bestelenmiş müzikten ayırt edilmesini hem dinleyiciler hem de otomatik sistemler için giderek güçleştirmiştir. Bu çalışmada akustik öznitelik analizine dayalı çok modelli bir topluluk sistemi olan AURIS önerilmektedir. AURIS, librosa kütüphanesi aracılığıyla spektral, zamansal, ritmik, armonik ve vokal boyutları kapsayan 47 öznitelik çıkarmakta ve bu vektörü 2.082 yapay zeka kaynaklı ve 3.113 insan kaynaklı toplam 5.195 örnekten oluşan veri kümesi üzerinde eğitilen on bir sınıflandırma modeline beslemektedir. Modeller, geleneksel makine öğrenmesi (Lojistik Regresyon, Rastgele Orman, Gradyan Artırma, SVM, ÇKA, XGBoost, LightGBM) ve derin öğrenme (Derin ÇKA, 1B-CNN, Artık ÇKA, Dikkat ÇKA) ailelerinden seçilmiştir. Eğitim süreci, sınıf dengesizliğini hesaba katmak için her katmanda Youden's J istatistiğine dayalı eşik optimizasyonu uygulanan 5-katlı tabakalı çapraz doğrulama protokolünü kullanmaktadır. Deneysel sonuçlar, LightGBM modelinin 0,9548'luk ROC-AUC değeri ile en yüksek performansı sergilediğini, Derin ÇKA modelinin ise 0,9542 ile çok yakın bir ikinci sıra elde ettiğini göstermektedir. LightGBM için Brier skoru 0,083 olarak ölçülmüş, modelin iyi kalibre edilmiş olasılık tahminleri ürettiği teyit edilmiştir. Spektral düzlük (spectral flatness) yapay zeka ile insan müziğini ayırt etmede en belirleyici tekil özellik olarak belirlenmiştir. Sistem, Hugging Face Spaces üzerinde dosya yükleme ve canlı mikrofon girişi yoluyla gerçek zamanlı analiz sunan halka açık bir web uygulaması olarak yayınlanmıştır.</w:t>
       </w:r>
     </w:p>
     <w:p>
@@ -255,7 +255,7 @@
           <w:i w:val="0"/>
           <w:sz w:val="18"/>
         </w:rPr>
-        <w:t>The rapid progress of AI-based music generation systems such as Suno, Udio, and MusicGen has made it increasingly difficult, for both human listeners and automated systems, to tell AI-generated recordings apart from human-composed music. This paper introduces AURIS, a multi-model ensemble system that approaches the problem from the side of handcrafted acoustic features. AURIS extracts a 47-dimensional feature vector spanning spectral, temporal, rhythmic, harmonic, and vocal dimensions using the librosa library, and feeds this vector into eleven classification models trained on a curated dataset of 5,195 samples (2,082 AI-generated, 3,113 human-composed). The model pool is intentionally heterogeneous: it includes seven classical machine learning algorithms (Logistic Regression, Random Forest, Gradient Boosting, SVM-RBF, MLP, XGBoost, LightGBM) alongside four deep learning architectures (Deep MLP, 1D-CNN, Residual MLP, Attention MLP). Model training follows a 5-fold stratified cross-validation protocol in which the decision threshold is re-estimated per fold via Youden's J statistic in order to handle the 1:1.5 class imbalance. Experimental results show that LightGBM reaches the highest mean ROC-AUC at 0.9549, with Deep MLP a very narrow second at 0.9537. The Brier score of 0.083 indicates that the model produces well-calibrated probability estimates rather than merely useful ranking scores. Spectral flatness is identified as the single most discriminative feature for the AI-versus-human distinction. The full system is released as a public web application on Hugging Face Spaces, supporting both file upload and live microphone input.</w:t>
+        <w:t>The rapid progress of AI-based music generation systems such as Suno, Udio, and MusicGen has made it increasingly difficult, for both human listeners and automated systems, to tell AI-generated recordings apart from human-composed music. This paper introduces AURIS, a multi-model ensemble system that approaches the problem from the side of handcrafted acoustic features. AURIS extracts a 47-dimensional feature vector spanning spectral, temporal, rhythmic, harmonic, and vocal dimensions using the librosa library, and feeds this vector into eleven classification models trained on a curated dataset of 5,195 samples (2,082 AI-generated, 3,113 human-composed). The model pool is intentionally heterogeneous: it includes seven classical machine learning algorithms (Logistic Regression, Random Forest, Gradient Boosting, SVM-RBF, MLP, XGBoost, LightGBM) alongside four deep learning architectures (Deep MLP, 1D-CNN, Residual MLP, Attention MLP). Model training follows a 5-fold stratified cross-validation protocol in which the decision threshold is re-estimated per fold via Youden's J statistic in order to handle the 1:1.5 class imbalance. Experimental results show that LightGBM reaches the highest mean ROC-AUC at 0.9548, with Deep MLP a very narrow second at 0.9542. The Brier score of 0.083 indicates that the model produces well-calibrated probability estimates rather than merely useful ranking scores. Spectral flatness is identified as the single most discriminative feature for the AI-versus-human distinction. The full system is released as a public web application on Hugging Face Spaces, supporting both file upload and live microphone input.</w:t>
       </w:r>
     </w:p>
     <w:p>
@@ -438,7 +438,7 @@
           <w:i w:val="0"/>
           <w:sz w:val="22"/>
         </w:rPr>
-        <w:t>Figure 1 provides an end-to-end view of the system. The remainder of the paper is organised as follows. Section 2 reviews related work in audio deepfake detection, transformer-based audio representations, ensemble methods for audio, and recent AI-music detection literature. Section 3 describes the dataset, the feature extraction pipeline, the eleven classification models, and the training protocol. Section 4 reports experimental results across all models and discusses feature importance and calibration. Section 5 interprets the findings and acknowledges the limitations of the present study, and Section 6 concludes with directions for future work. The system is publicly available at https://huggingface.co/spaces/Rtur2003/AURIS.</w:t>
+        <w:t>Figure 1 provides an end-to-end view of the system. The remainder of the paper is organised as follows. The rest of this section reviews related work in audio deepfake detection, transformer-based audio representations, ensemble methods for audio, and recent AI-music detection literature. Section 2 describes the dataset, the feature extraction pipeline, the eleven classification models, and the training protocol. Section 3 reports experimental results across all models, interprets feature importance and calibration, and acknowledges the limitations of the present study. Section 4 concludes with directions for future work. The system is publicly available at https://huggingface.co/spaces/Rtur2003/AURIS.</w:t>
       </w:r>
     </w:p>
     <w:p>
@@ -503,24 +503,6 @@
     <w:p>
       <w:pPr>
         <w:jc w:val="left"/>
-        <w:spacing w:before="280" w:after="120" w:line="240" w:lineRule="auto"/>
-        <w:keepNext/>
-        <w:keepLines/>
-      </w:pPr>
-      <w:r>
-        <w:rPr>
-          <w:rFonts w:ascii="Times New Roman" w:hAnsi="Times New Roman" w:cs="Times New Roman"/>
-          <w:rFonts w:ascii="Times New Roman" w:hAnsi="Times New Roman"/>
-          <w:b/>
-          <w:i w:val="0"/>
-          <w:sz w:val="22"/>
-        </w:rPr>
-        <w:t>2. RELATED WORK</w:t>
-      </w:r>
-    </w:p>
-    <w:p>
-      <w:pPr>
-        <w:jc w:val="left"/>
         <w:spacing w:before="200" w:after="80" w:line="240" w:lineRule="auto"/>
         <w:keepNext/>
         <w:keepLines/>
@@ -533,7 +515,7 @@
           <w:i/>
           <w:sz w:val="22"/>
         </w:rPr>
-        <w:t>2.1. Audio Deepfake Detection for Speech</w:t>
+        <w:t>1.1. Audio Deepfake Detection for Speech</w:t>
       </w:r>
     </w:p>
     <w:p>
@@ -567,7 +549,7 @@
           <w:i/>
           <w:sz w:val="22"/>
         </w:rPr>
-        <w:t>2.2. Transformer-Based Audio Representations</w:t>
+        <w:t>1.2. Transformer-Based Audio Representations</w:t>
       </w:r>
     </w:p>
     <w:p>
@@ -601,7 +583,7 @@
           <w:i/>
           <w:sz w:val="22"/>
         </w:rPr>
-        <w:t>2.3. Ensemble Methods and Gradient Boosting for Audio</w:t>
+        <w:t>1.3. Ensemble Methods and Gradient Boosting for Audio</w:t>
       </w:r>
     </w:p>
     <w:p>
@@ -635,7 +617,7 @@
           <w:i/>
           <w:sz w:val="22"/>
         </w:rPr>
-        <w:t>2.4. AI Music Generation Systems</w:t>
+        <w:t>1.4. AI Music Generation Systems</w:t>
       </w:r>
     </w:p>
     <w:p>
@@ -669,7 +651,7 @@
           <w:i/>
           <w:sz w:val="22"/>
         </w:rPr>
-        <w:t>2.5. Recent Advances in AI Music Detection (2025–2026)</w:t>
+        <w:t>1.5. Recent Advances in AI Music Detection (2024–2025)</w:t>
       </w:r>
     </w:p>
     <w:p>
@@ -703,7 +685,7 @@
           <w:i w:val="0"/>
           <w:sz w:val="22"/>
         </w:rPr>
-        <w:t>3. MATERIAL AND METHOD</w:t>
+        <w:t>2. MATERIAL AND METHOD</w:t>
       </w:r>
     </w:p>
     <w:p>
@@ -721,7 +703,7 @@
           <w:i/>
           <w:sz w:val="22"/>
         </w:rPr>
-        <w:t>3.1. Dataset</w:t>
+        <w:t>2.1. Dataset</w:t>
       </w:r>
     </w:p>
     <w:p>
@@ -747,15 +729,15 @@
         <w:tblLook w:firstColumn="1" w:firstRow="1" w:lastColumn="0" w:lastRow="0" w:noHBand="0" w:noVBand="1" w:val="04A0"/>
       </w:tblPr>
       <w:tblGrid>
-        <w:gridCol w:w="2351"/>
-        <w:gridCol w:w="2351"/>
-        <w:gridCol w:w="2351"/>
-        <w:gridCol w:w="2351"/>
+        <w:gridCol w:w="2409"/>
+        <w:gridCol w:w="2409"/>
+        <w:gridCol w:w="2409"/>
+        <w:gridCol w:w="2409"/>
       </w:tblGrid>
       <w:tr>
         <w:tc>
           <w:tcPr>
-            <w:tcW w:type="dxa" w:w="2351"/>
+            <w:tcW w:type="dxa" w:w="2409"/>
             <w:shd w:val="clear" w:color="auto" w:fill="C99347"/>
           </w:tcPr>
           <w:p>
@@ -777,7 +759,7 @@
         </w:tc>
         <w:tc>
           <w:tcPr>
-            <w:tcW w:type="dxa" w:w="2351"/>
+            <w:tcW w:type="dxa" w:w="2409"/>
             <w:shd w:val="clear" w:color="auto" w:fill="C99347"/>
           </w:tcPr>
           <w:p>
@@ -799,7 +781,7 @@
         </w:tc>
         <w:tc>
           <w:tcPr>
-            <w:tcW w:type="dxa" w:w="2351"/>
+            <w:tcW w:type="dxa" w:w="2409"/>
             <w:shd w:val="clear" w:color="auto" w:fill="C99347"/>
           </w:tcPr>
           <w:p>
@@ -821,7 +803,7 @@
         </w:tc>
         <w:tc>
           <w:tcPr>
-            <w:tcW w:type="dxa" w:w="2351"/>
+            <w:tcW w:type="dxa" w:w="2409"/>
             <w:shd w:val="clear" w:color="auto" w:fill="C99347"/>
           </w:tcPr>
           <w:p>
@@ -845,7 +827,7 @@
       <w:tr>
         <w:tc>
           <w:tcPr>
-            <w:tcW w:type="dxa" w:w="2351"/>
+            <w:tcW w:type="dxa" w:w="2409"/>
             <w:shd w:val="clear" w:color="auto" w:fill="F5F0E8"/>
           </w:tcPr>
           <w:p>
@@ -867,7 +849,7 @@
         </w:tc>
         <w:tc>
           <w:tcPr>
-            <w:tcW w:type="dxa" w:w="2351"/>
+            <w:tcW w:type="dxa" w:w="2409"/>
             <w:shd w:val="clear" w:color="auto" w:fill="F5F0E8"/>
           </w:tcPr>
           <w:p>
@@ -889,7 +871,7 @@
         </w:tc>
         <w:tc>
           <w:tcPr>
-            <w:tcW w:type="dxa" w:w="2351"/>
+            <w:tcW w:type="dxa" w:w="2409"/>
             <w:shd w:val="clear" w:color="auto" w:fill="F5F0E8"/>
           </w:tcPr>
           <w:p>
@@ -911,7 +893,7 @@
         </w:tc>
         <w:tc>
           <w:tcPr>
-            <w:tcW w:type="dxa" w:w="2351"/>
+            <w:tcW w:type="dxa" w:w="2409"/>
             <w:shd w:val="clear" w:color="auto" w:fill="F5F0E8"/>
           </w:tcPr>
           <w:p>
@@ -935,7 +917,7 @@
       <w:tr>
         <w:tc>
           <w:tcPr>
-            <w:tcW w:type="dxa" w:w="2351"/>
+            <w:tcW w:type="dxa" w:w="2409"/>
             <w:shd w:val="clear" w:color="auto" w:fill="FFFFFF"/>
           </w:tcPr>
           <w:p>
@@ -957,7 +939,7 @@
         </w:tc>
         <w:tc>
           <w:tcPr>
-            <w:tcW w:type="dxa" w:w="2351"/>
+            <w:tcW w:type="dxa" w:w="2409"/>
             <w:shd w:val="clear" w:color="auto" w:fill="FFFFFF"/>
           </w:tcPr>
           <w:p>
@@ -979,7 +961,7 @@
         </w:tc>
         <w:tc>
           <w:tcPr>
-            <w:tcW w:type="dxa" w:w="2351"/>
+            <w:tcW w:type="dxa" w:w="2409"/>
             <w:shd w:val="clear" w:color="auto" w:fill="FFFFFF"/>
           </w:tcPr>
           <w:p>
@@ -1001,7 +983,7 @@
         </w:tc>
         <w:tc>
           <w:tcPr>
-            <w:tcW w:type="dxa" w:w="2351"/>
+            <w:tcW w:type="dxa" w:w="2409"/>
             <w:shd w:val="clear" w:color="auto" w:fill="FFFFFF"/>
           </w:tcPr>
           <w:p>
@@ -1025,7 +1007,7 @@
       <w:tr>
         <w:tc>
           <w:tcPr>
-            <w:tcW w:type="dxa" w:w="2351"/>
+            <w:tcW w:type="dxa" w:w="2409"/>
             <w:shd w:val="clear" w:color="auto" w:fill="F5F0E8"/>
           </w:tcPr>
           <w:p>
@@ -1047,7 +1029,7 @@
         </w:tc>
         <w:tc>
           <w:tcPr>
-            <w:tcW w:type="dxa" w:w="2351"/>
+            <w:tcW w:type="dxa" w:w="2409"/>
             <w:shd w:val="clear" w:color="auto" w:fill="F5F0E8"/>
           </w:tcPr>
           <w:p>
@@ -1069,7 +1051,7 @@
         </w:tc>
         <w:tc>
           <w:tcPr>
-            <w:tcW w:type="dxa" w:w="2351"/>
+            <w:tcW w:type="dxa" w:w="2409"/>
             <w:shd w:val="clear" w:color="auto" w:fill="F5F0E8"/>
           </w:tcPr>
           <w:p>
@@ -1091,7 +1073,7 @@
         </w:tc>
         <w:tc>
           <w:tcPr>
-            <w:tcW w:type="dxa" w:w="2351"/>
+            <w:tcW w:type="dxa" w:w="2409"/>
             <w:shd w:val="clear" w:color="auto" w:fill="F5F0E8"/>
           </w:tcPr>
           <w:p>
@@ -1115,7 +1097,7 @@
       <w:tr>
         <w:tc>
           <w:tcPr>
-            <w:tcW w:type="dxa" w:w="2351"/>
+            <w:tcW w:type="dxa" w:w="2409"/>
             <w:shd w:val="clear" w:color="auto" w:fill="FFFFFF"/>
           </w:tcPr>
           <w:p>
@@ -1137,7 +1119,7 @@
         </w:tc>
         <w:tc>
           <w:tcPr>
-            <w:tcW w:type="dxa" w:w="2351"/>
+            <w:tcW w:type="dxa" w:w="2409"/>
             <w:shd w:val="clear" w:color="auto" w:fill="FFFFFF"/>
           </w:tcPr>
           <w:p>
@@ -1159,7 +1141,7 @@
         </w:tc>
         <w:tc>
           <w:tcPr>
-            <w:tcW w:type="dxa" w:w="2351"/>
+            <w:tcW w:type="dxa" w:w="2409"/>
             <w:shd w:val="clear" w:color="auto" w:fill="FFFFFF"/>
           </w:tcPr>
           <w:p>
@@ -1181,7 +1163,7 @@
         </w:tc>
         <w:tc>
           <w:tcPr>
-            <w:tcW w:type="dxa" w:w="2351"/>
+            <w:tcW w:type="dxa" w:w="2409"/>
             <w:shd w:val="clear" w:color="auto" w:fill="FFFFFF"/>
           </w:tcPr>
           <w:p>
@@ -1205,7 +1187,7 @@
       <w:tr>
         <w:tc>
           <w:tcPr>
-            <w:tcW w:type="dxa" w:w="2351"/>
+            <w:tcW w:type="dxa" w:w="2409"/>
             <w:shd w:val="clear" w:color="auto" w:fill="F5F0E8"/>
           </w:tcPr>
           <w:p>
@@ -1227,7 +1209,7 @@
         </w:tc>
         <w:tc>
           <w:tcPr>
-            <w:tcW w:type="dxa" w:w="2351"/>
+            <w:tcW w:type="dxa" w:w="2409"/>
             <w:shd w:val="clear" w:color="auto" w:fill="F5F0E8"/>
           </w:tcPr>
           <w:p>
@@ -1249,7 +1231,7 @@
         </w:tc>
         <w:tc>
           <w:tcPr>
-            <w:tcW w:type="dxa" w:w="2351"/>
+            <w:tcW w:type="dxa" w:w="2409"/>
             <w:shd w:val="clear" w:color="auto" w:fill="F5F0E8"/>
           </w:tcPr>
           <w:p>
@@ -1271,7 +1253,7 @@
         </w:tc>
         <w:tc>
           <w:tcPr>
-            <w:tcW w:type="dxa" w:w="2351"/>
+            <w:tcW w:type="dxa" w:w="2409"/>
             <w:shd w:val="clear" w:color="auto" w:fill="F5F0E8"/>
           </w:tcPr>
           <w:p>
@@ -1295,7 +1277,7 @@
       <w:tr>
         <w:tc>
           <w:tcPr>
-            <w:tcW w:type="dxa" w:w="2351"/>
+            <w:tcW w:type="dxa" w:w="2409"/>
             <w:shd w:val="clear" w:color="auto" w:fill="FFFFFF"/>
           </w:tcPr>
           <w:p>
@@ -1317,7 +1299,7 @@
         </w:tc>
         <w:tc>
           <w:tcPr>
-            <w:tcW w:type="dxa" w:w="2351"/>
+            <w:tcW w:type="dxa" w:w="2409"/>
             <w:shd w:val="clear" w:color="auto" w:fill="FFFFFF"/>
           </w:tcPr>
           <w:p>
@@ -1339,7 +1321,7 @@
         </w:tc>
         <w:tc>
           <w:tcPr>
-            <w:tcW w:type="dxa" w:w="2351"/>
+            <w:tcW w:type="dxa" w:w="2409"/>
             <w:shd w:val="clear" w:color="auto" w:fill="FFFFFF"/>
           </w:tcPr>
           <w:p>
@@ -1361,7 +1343,7 @@
         </w:tc>
         <w:tc>
           <w:tcPr>
-            <w:tcW w:type="dxa" w:w="2351"/>
+            <w:tcW w:type="dxa" w:w="2409"/>
             <w:shd w:val="clear" w:color="auto" w:fill="FFFFFF"/>
           </w:tcPr>
           <w:p>
@@ -1385,7 +1367,7 @@
       <w:tr>
         <w:tc>
           <w:tcPr>
-            <w:tcW w:type="dxa" w:w="2351"/>
+            <w:tcW w:type="dxa" w:w="2409"/>
             <w:shd w:val="clear" w:color="auto" w:fill="F5F0E8"/>
           </w:tcPr>
           <w:p>
@@ -1407,7 +1389,7 @@
         </w:tc>
         <w:tc>
           <w:tcPr>
-            <w:tcW w:type="dxa" w:w="2351"/>
+            <w:tcW w:type="dxa" w:w="2409"/>
             <w:shd w:val="clear" w:color="auto" w:fill="F5F0E8"/>
           </w:tcPr>
           <w:p>
@@ -1429,7 +1411,7 @@
         </w:tc>
         <w:tc>
           <w:tcPr>
-            <w:tcW w:type="dxa" w:w="2351"/>
+            <w:tcW w:type="dxa" w:w="2409"/>
             <w:shd w:val="clear" w:color="auto" w:fill="F5F0E8"/>
           </w:tcPr>
           <w:p>
@@ -1451,7 +1433,7 @@
         </w:tc>
         <w:tc>
           <w:tcPr>
-            <w:tcW w:type="dxa" w:w="2351"/>
+            <w:tcW w:type="dxa" w:w="2409"/>
             <w:shd w:val="clear" w:color="auto" w:fill="F5F0E8"/>
           </w:tcPr>
           <w:p>
@@ -1546,7 +1528,7 @@
           <w:i/>
           <w:sz w:val="20"/>
         </w:rPr>
-        <w:t>Figure 2. Distribution of selected acoustic features for AI-generated (red) and human-composed (green) samples. The separation visible in spectral flatness and onset strength previews the importance ranking reported in Section 4.3.</w:t>
+        <w:t>Figure 2. Distribution of selected acoustic features for AI-generated (red) and human-composed (green) samples. The separation visible in spectral flatness and onset strength previews the importance ranking reported in Section 3.4.</w:t>
       </w:r>
     </w:p>
     <w:p>
@@ -1564,7 +1546,7 @@
           <w:i/>
           <w:sz w:val="22"/>
         </w:rPr>
-        <w:t>3.2. Feature Extraction</w:t>
+        <w:t>2.2. Feature Extraction</w:t>
       </w:r>
     </w:p>
     <w:p>
@@ -1614,7 +1596,7 @@
           <w:i/>
           <w:sz w:val="22"/>
         </w:rPr>
-        <w:t>3.3. Classification Models</w:t>
+        <w:t>2.3. Classification Models</w:t>
       </w:r>
     </w:p>
     <w:p>
@@ -1656,14 +1638,14 @@
         <w:tblLook w:firstColumn="1" w:firstRow="1" w:lastColumn="0" w:lastRow="0" w:noHBand="0" w:noVBand="1" w:val="04A0"/>
       </w:tblPr>
       <w:tblGrid>
-        <w:gridCol w:w="3135"/>
-        <w:gridCol w:w="3135"/>
-        <w:gridCol w:w="3135"/>
+        <w:gridCol w:w="3213"/>
+        <w:gridCol w:w="3213"/>
+        <w:gridCol w:w="3213"/>
       </w:tblGrid>
       <w:tr>
         <w:tc>
           <w:tcPr>
-            <w:tcW w:type="dxa" w:w="3135"/>
+            <w:tcW w:type="dxa" w:w="3213"/>
             <w:shd w:val="clear" w:color="auto" w:fill="C99347"/>
           </w:tcPr>
           <w:p>
@@ -1685,7 +1667,7 @@
         </w:tc>
         <w:tc>
           <w:tcPr>
-            <w:tcW w:type="dxa" w:w="3135"/>
+            <w:tcW w:type="dxa" w:w="3213"/>
             <w:shd w:val="clear" w:color="auto" w:fill="C99347"/>
           </w:tcPr>
           <w:p>
@@ -1707,7 +1689,7 @@
         </w:tc>
         <w:tc>
           <w:tcPr>
-            <w:tcW w:type="dxa" w:w="3135"/>
+            <w:tcW w:type="dxa" w:w="3213"/>
             <w:shd w:val="clear" w:color="auto" w:fill="C99347"/>
           </w:tcPr>
           <w:p>
@@ -1731,7 +1713,7 @@
       <w:tr>
         <w:tc>
           <w:tcPr>
-            <w:tcW w:type="dxa" w:w="3135"/>
+            <w:tcW w:type="dxa" w:w="3213"/>
             <w:shd w:val="clear" w:color="auto" w:fill="F5F0E8"/>
           </w:tcPr>
           <w:p>
@@ -1753,7 +1735,7 @@
         </w:tc>
         <w:tc>
           <w:tcPr>
-            <w:tcW w:type="dxa" w:w="3135"/>
+            <w:tcW w:type="dxa" w:w="3213"/>
             <w:shd w:val="clear" w:color="auto" w:fill="F5F0E8"/>
           </w:tcPr>
           <w:p>
@@ -1775,7 +1757,7 @@
         </w:tc>
         <w:tc>
           <w:tcPr>
-            <w:tcW w:type="dxa" w:w="3135"/>
+            <w:tcW w:type="dxa" w:w="3213"/>
             <w:shd w:val="clear" w:color="auto" w:fill="F5F0E8"/>
           </w:tcPr>
           <w:p>
@@ -1799,7 +1781,7 @@
       <w:tr>
         <w:tc>
           <w:tcPr>
-            <w:tcW w:type="dxa" w:w="3135"/>
+            <w:tcW w:type="dxa" w:w="3213"/>
             <w:shd w:val="clear" w:color="auto" w:fill="FFFFFF"/>
           </w:tcPr>
           <w:p>
@@ -1821,7 +1803,7 @@
         </w:tc>
         <w:tc>
           <w:tcPr>
-            <w:tcW w:type="dxa" w:w="3135"/>
+            <w:tcW w:type="dxa" w:w="3213"/>
             <w:shd w:val="clear" w:color="auto" w:fill="FFFFFF"/>
           </w:tcPr>
           <w:p>
@@ -1843,7 +1825,7 @@
         </w:tc>
         <w:tc>
           <w:tcPr>
-            <w:tcW w:type="dxa" w:w="3135"/>
+            <w:tcW w:type="dxa" w:w="3213"/>
             <w:shd w:val="clear" w:color="auto" w:fill="FFFFFF"/>
           </w:tcPr>
           <w:p>
@@ -1867,7 +1849,7 @@
       <w:tr>
         <w:tc>
           <w:tcPr>
-            <w:tcW w:type="dxa" w:w="3135"/>
+            <w:tcW w:type="dxa" w:w="3213"/>
             <w:shd w:val="clear" w:color="auto" w:fill="F5F0E8"/>
           </w:tcPr>
           <w:p>
@@ -1889,7 +1871,7 @@
         </w:tc>
         <w:tc>
           <w:tcPr>
-            <w:tcW w:type="dxa" w:w="3135"/>
+            <w:tcW w:type="dxa" w:w="3213"/>
             <w:shd w:val="clear" w:color="auto" w:fill="F5F0E8"/>
           </w:tcPr>
           <w:p>
@@ -1911,7 +1893,7 @@
         </w:tc>
         <w:tc>
           <w:tcPr>
-            <w:tcW w:type="dxa" w:w="3135"/>
+            <w:tcW w:type="dxa" w:w="3213"/>
             <w:shd w:val="clear" w:color="auto" w:fill="F5F0E8"/>
           </w:tcPr>
           <w:p>
@@ -1935,7 +1917,7 @@
       <w:tr>
         <w:tc>
           <w:tcPr>
-            <w:tcW w:type="dxa" w:w="3135"/>
+            <w:tcW w:type="dxa" w:w="3213"/>
             <w:shd w:val="clear" w:color="auto" w:fill="FFFFFF"/>
           </w:tcPr>
           <w:p>
@@ -1957,7 +1939,7 @@
         </w:tc>
         <w:tc>
           <w:tcPr>
-            <w:tcW w:type="dxa" w:w="3135"/>
+            <w:tcW w:type="dxa" w:w="3213"/>
             <w:shd w:val="clear" w:color="auto" w:fill="FFFFFF"/>
           </w:tcPr>
           <w:p>
@@ -1979,7 +1961,7 @@
         </w:tc>
         <w:tc>
           <w:tcPr>
-            <w:tcW w:type="dxa" w:w="3135"/>
+            <w:tcW w:type="dxa" w:w="3213"/>
             <w:shd w:val="clear" w:color="auto" w:fill="FFFFFF"/>
           </w:tcPr>
           <w:p>
@@ -2003,7 +1985,7 @@
       <w:tr>
         <w:tc>
           <w:tcPr>
-            <w:tcW w:type="dxa" w:w="3135"/>
+            <w:tcW w:type="dxa" w:w="3213"/>
             <w:shd w:val="clear" w:color="auto" w:fill="F5F0E8"/>
           </w:tcPr>
           <w:p>
@@ -2025,7 +2007,7 @@
         </w:tc>
         <w:tc>
           <w:tcPr>
-            <w:tcW w:type="dxa" w:w="3135"/>
+            <w:tcW w:type="dxa" w:w="3213"/>
             <w:shd w:val="clear" w:color="auto" w:fill="F5F0E8"/>
           </w:tcPr>
           <w:p>
@@ -2047,7 +2029,7 @@
         </w:tc>
         <w:tc>
           <w:tcPr>
-            <w:tcW w:type="dxa" w:w="3135"/>
+            <w:tcW w:type="dxa" w:w="3213"/>
             <w:shd w:val="clear" w:color="auto" w:fill="F5F0E8"/>
           </w:tcPr>
           <w:p>
@@ -2071,7 +2053,7 @@
       <w:tr>
         <w:tc>
           <w:tcPr>
-            <w:tcW w:type="dxa" w:w="3135"/>
+            <w:tcW w:type="dxa" w:w="3213"/>
             <w:shd w:val="clear" w:color="auto" w:fill="FFFFFF"/>
           </w:tcPr>
           <w:p>
@@ -2093,7 +2075,7 @@
         </w:tc>
         <w:tc>
           <w:tcPr>
-            <w:tcW w:type="dxa" w:w="3135"/>
+            <w:tcW w:type="dxa" w:w="3213"/>
             <w:shd w:val="clear" w:color="auto" w:fill="FFFFFF"/>
           </w:tcPr>
           <w:p>
@@ -2115,7 +2097,7 @@
         </w:tc>
         <w:tc>
           <w:tcPr>
-            <w:tcW w:type="dxa" w:w="3135"/>
+            <w:tcW w:type="dxa" w:w="3213"/>
             <w:shd w:val="clear" w:color="auto" w:fill="FFFFFF"/>
           </w:tcPr>
           <w:p>
@@ -2139,7 +2121,7 @@
       <w:tr>
         <w:tc>
           <w:tcPr>
-            <w:tcW w:type="dxa" w:w="3135"/>
+            <w:tcW w:type="dxa" w:w="3213"/>
             <w:shd w:val="clear" w:color="auto" w:fill="F5F0E8"/>
           </w:tcPr>
           <w:p>
@@ -2161,7 +2143,7 @@
         </w:tc>
         <w:tc>
           <w:tcPr>
-            <w:tcW w:type="dxa" w:w="3135"/>
+            <w:tcW w:type="dxa" w:w="3213"/>
             <w:shd w:val="clear" w:color="auto" w:fill="F5F0E8"/>
           </w:tcPr>
           <w:p>
@@ -2183,7 +2165,7 @@
         </w:tc>
         <w:tc>
           <w:tcPr>
-            <w:tcW w:type="dxa" w:w="3135"/>
+            <w:tcW w:type="dxa" w:w="3213"/>
             <w:shd w:val="clear" w:color="auto" w:fill="F5F0E8"/>
           </w:tcPr>
           <w:p>
@@ -2207,7 +2189,7 @@
       <w:tr>
         <w:tc>
           <w:tcPr>
-            <w:tcW w:type="dxa" w:w="3135"/>
+            <w:tcW w:type="dxa" w:w="3213"/>
             <w:shd w:val="clear" w:color="auto" w:fill="FFFFFF"/>
           </w:tcPr>
           <w:p>
@@ -2229,7 +2211,7 @@
         </w:tc>
         <w:tc>
           <w:tcPr>
-            <w:tcW w:type="dxa" w:w="3135"/>
+            <w:tcW w:type="dxa" w:w="3213"/>
             <w:shd w:val="clear" w:color="auto" w:fill="FFFFFF"/>
           </w:tcPr>
           <w:p>
@@ -2251,7 +2233,7 @@
         </w:tc>
         <w:tc>
           <w:tcPr>
-            <w:tcW w:type="dxa" w:w="3135"/>
+            <w:tcW w:type="dxa" w:w="3213"/>
             <w:shd w:val="clear" w:color="auto" w:fill="FFFFFF"/>
           </w:tcPr>
           <w:p>
@@ -2275,7 +2257,7 @@
       <w:tr>
         <w:tc>
           <w:tcPr>
-            <w:tcW w:type="dxa" w:w="3135"/>
+            <w:tcW w:type="dxa" w:w="3213"/>
             <w:shd w:val="clear" w:color="auto" w:fill="F5F0E8"/>
           </w:tcPr>
           <w:p>
@@ -2297,7 +2279,7 @@
         </w:tc>
         <w:tc>
           <w:tcPr>
-            <w:tcW w:type="dxa" w:w="3135"/>
+            <w:tcW w:type="dxa" w:w="3213"/>
             <w:shd w:val="clear" w:color="auto" w:fill="F5F0E8"/>
           </w:tcPr>
           <w:p>
@@ -2319,7 +2301,7 @@
         </w:tc>
         <w:tc>
           <w:tcPr>
-            <w:tcW w:type="dxa" w:w="3135"/>
+            <w:tcW w:type="dxa" w:w="3213"/>
             <w:shd w:val="clear" w:color="auto" w:fill="F5F0E8"/>
           </w:tcPr>
           <w:p>
@@ -2343,7 +2325,7 @@
       <w:tr>
         <w:tc>
           <w:tcPr>
-            <w:tcW w:type="dxa" w:w="3135"/>
+            <w:tcW w:type="dxa" w:w="3213"/>
             <w:shd w:val="clear" w:color="auto" w:fill="FFFFFF"/>
           </w:tcPr>
           <w:p>
@@ -2365,7 +2347,7 @@
         </w:tc>
         <w:tc>
           <w:tcPr>
-            <w:tcW w:type="dxa" w:w="3135"/>
+            <w:tcW w:type="dxa" w:w="3213"/>
             <w:shd w:val="clear" w:color="auto" w:fill="FFFFFF"/>
           </w:tcPr>
           <w:p>
@@ -2387,7 +2369,7 @@
         </w:tc>
         <w:tc>
           <w:tcPr>
-            <w:tcW w:type="dxa" w:w="3135"/>
+            <w:tcW w:type="dxa" w:w="3213"/>
             <w:shd w:val="clear" w:color="auto" w:fill="FFFFFF"/>
           </w:tcPr>
           <w:p>
@@ -2411,7 +2393,7 @@
       <w:tr>
         <w:tc>
           <w:tcPr>
-            <w:tcW w:type="dxa" w:w="3135"/>
+            <w:tcW w:type="dxa" w:w="3213"/>
             <w:shd w:val="clear" w:color="auto" w:fill="F5F0E8"/>
           </w:tcPr>
           <w:p>
@@ -2433,7 +2415,7 @@
         </w:tc>
         <w:tc>
           <w:tcPr>
-            <w:tcW w:type="dxa" w:w="3135"/>
+            <w:tcW w:type="dxa" w:w="3213"/>
             <w:shd w:val="clear" w:color="auto" w:fill="F5F0E8"/>
           </w:tcPr>
           <w:p>
@@ -2455,7 +2437,7 @@
         </w:tc>
         <w:tc>
           <w:tcPr>
-            <w:tcW w:type="dxa" w:w="3135"/>
+            <w:tcW w:type="dxa" w:w="3213"/>
             <w:shd w:val="clear" w:color="auto" w:fill="F5F0E8"/>
           </w:tcPr>
           <w:p>
@@ -2509,7 +2491,7 @@
           <w:i/>
           <w:sz w:val="22"/>
         </w:rPr>
-        <w:t>3.4. Training Protocol and Threshold Optimisation</w:t>
+        <w:t>2.4. Training Protocol and Threshold Optimisation</w:t>
       </w:r>
     </w:p>
     <w:p>
@@ -2580,12 +2562,12 @@
         <w:tblLook w:firstColumn="1" w:firstRow="1" w:lastColumn="0" w:lastRow="0" w:noHBand="0" w:noVBand="1" w:val="04A0"/>
       </w:tblPr>
       <w:tblGrid>
-        <w:gridCol w:w="9406"/>
+        <w:gridCol w:w="9638"/>
       </w:tblGrid>
       <w:tr>
         <w:tc>
           <w:tcPr>
-            <w:tcW w:type="dxa" w:w="9406"/>
+            <w:tcW w:type="dxa" w:w="9638"/>
             <w:shd w:val="clear" w:color="auto" w:fill="F5F0E8"/>
           </w:tcPr>
           <w:p>
@@ -2906,7 +2888,7 @@
           <w:i w:val="0"/>
           <w:sz w:val="22"/>
         </w:rPr>
-        <w:t>4. RESULTS</w:t>
+        <w:t>3. RESULTS AND DISCUSSION</w:t>
       </w:r>
     </w:p>
     <w:p>
@@ -2924,7 +2906,7 @@
           <w:i/>
           <w:sz w:val="22"/>
         </w:rPr>
-        <w:t>4.1. Overall Model Performance</w:t>
+        <w:t>3.1. Overall Model Performance</w:t>
       </w:r>
     </w:p>
     <w:p>
@@ -2940,7 +2922,7 @@
           <w:i w:val="0"/>
           <w:sz w:val="22"/>
         </w:rPr>
-        <w:t>Table 3 reports the 5-fold cross-validation results for the eleven models, sorted by ROC-AUC. LightGBM obtained the highest mean ROC-AUC of 0.9549, with Deep MLP a very close second at 0.9537 — a difference of only 0.0012 in AUC. Deep MLP, however, achieved the highest accuracy (0.8849) and F1-score (0.8596) of the entire pool, narrowly ahead of LightGBM at 0.8839 accuracy and 0.8575 F1. The remaining ensemble methods (XGBoost, Random Forest, Gradient Boosting) and the SVM with RBF kernel all cluster in the 0.93–0.95 AUC range. Logistic Regression and the 1D-CNN are the weakest performers in the pool, which suggests that linear decision boundaries are too restrictive for the underlying feature distribution and that convolutional inductive biases do not transfer well to a flat 47-dimensional input.</w:t>
+        <w:t>Table 3 reports the 5-fold cross-validation results for the eleven models, sorted by ROC-AUC. LightGBM obtained the highest mean ROC-AUC of 0.9548, with Deep MLP a very close second at 0.9542 — a difference of only 0.0006 in AUC. Deep MLP, however, achieved the highest accuracy (0.8849) and F1-score (0.8596) of the entire pool, narrowly ahead of LightGBM at 0.8839 accuracy and 0.8575 F1. The remaining ensemble methods (XGBoost, Random Forest, Gradient Boosting) and the SVM with RBF kernel all cluster in the 0.93–0.95 AUC range. Logistic Regression and the 1D-CNN are the weakest performers in the pool, which suggests that linear decision boundaries are too restrictive for the underlying feature distribution and that convolutional inductive biases do not transfer well to a flat 47-dimensional input.</w:t>
       </w:r>
     </w:p>
     <w:tbl>
@@ -2950,18 +2932,18 @@
         <w:tblLook w:firstColumn="1" w:firstRow="1" w:lastColumn="0" w:lastRow="0" w:noHBand="0" w:noVBand="1" w:val="04A0"/>
       </w:tblPr>
       <w:tblGrid>
-        <w:gridCol w:w="1344"/>
-        <w:gridCol w:w="1344"/>
-        <w:gridCol w:w="1344"/>
-        <w:gridCol w:w="1344"/>
-        <w:gridCol w:w="1344"/>
-        <w:gridCol w:w="1344"/>
-        <w:gridCol w:w="1344"/>
+        <w:gridCol w:w="1377"/>
+        <w:gridCol w:w="1377"/>
+        <w:gridCol w:w="1377"/>
+        <w:gridCol w:w="1377"/>
+        <w:gridCol w:w="1377"/>
+        <w:gridCol w:w="1377"/>
+        <w:gridCol w:w="1377"/>
       </w:tblGrid>
       <w:tr>
         <w:tc>
           <w:tcPr>
-            <w:tcW w:type="dxa" w:w="1344"/>
+            <w:tcW w:type="dxa" w:w="1377"/>
             <w:shd w:val="clear" w:color="auto" w:fill="C99347"/>
           </w:tcPr>
           <w:p>
@@ -2983,7 +2965,7 @@
         </w:tc>
         <w:tc>
           <w:tcPr>
-            <w:tcW w:type="dxa" w:w="1344"/>
+            <w:tcW w:type="dxa" w:w="1377"/>
             <w:shd w:val="clear" w:color="auto" w:fill="C99347"/>
           </w:tcPr>
           <w:p>
@@ -3005,7 +2987,7 @@
         </w:tc>
         <w:tc>
           <w:tcPr>
-            <w:tcW w:type="dxa" w:w="1344"/>
+            <w:tcW w:type="dxa" w:w="1377"/>
             <w:shd w:val="clear" w:color="auto" w:fill="C99347"/>
           </w:tcPr>
           <w:p>
@@ -3027,7 +3009,7 @@
         </w:tc>
         <w:tc>
           <w:tcPr>
-            <w:tcW w:type="dxa" w:w="1344"/>
+            <w:tcW w:type="dxa" w:w="1377"/>
             <w:shd w:val="clear" w:color="auto" w:fill="C99347"/>
           </w:tcPr>
           <w:p>
@@ -3049,7 +3031,7 @@
         </w:tc>
         <w:tc>
           <w:tcPr>
-            <w:tcW w:type="dxa" w:w="1344"/>
+            <w:tcW w:type="dxa" w:w="1377"/>
             <w:shd w:val="clear" w:color="auto" w:fill="C99347"/>
           </w:tcPr>
           <w:p>
@@ -3071,7 +3053,7 @@
         </w:tc>
         <w:tc>
           <w:tcPr>
-            <w:tcW w:type="dxa" w:w="1344"/>
+            <w:tcW w:type="dxa" w:w="1377"/>
             <w:shd w:val="clear" w:color="auto" w:fill="C99347"/>
           </w:tcPr>
           <w:p>
@@ -3093,7 +3075,7 @@
         </w:tc>
         <w:tc>
           <w:tcPr>
-            <w:tcW w:type="dxa" w:w="1344"/>
+            <w:tcW w:type="dxa" w:w="1377"/>
             <w:shd w:val="clear" w:color="auto" w:fill="C99347"/>
           </w:tcPr>
           <w:p>
@@ -3117,7 +3099,7 @@
       <w:tr>
         <w:tc>
           <w:tcPr>
-            <w:tcW w:type="dxa" w:w="1344"/>
+            <w:tcW w:type="dxa" w:w="1377"/>
             <w:shd w:val="clear" w:color="auto" w:fill="F5F0E8"/>
           </w:tcPr>
           <w:p>
@@ -3139,7 +3121,7 @@
         </w:tc>
         <w:tc>
           <w:tcPr>
-            <w:tcW w:type="dxa" w:w="1344"/>
+            <w:tcW w:type="dxa" w:w="1377"/>
             <w:shd w:val="clear" w:color="auto" w:fill="F5F0E8"/>
           </w:tcPr>
           <w:p>
@@ -3161,7 +3143,7 @@
         </w:tc>
         <w:tc>
           <w:tcPr>
-            <w:tcW w:type="dxa" w:w="1344"/>
+            <w:tcW w:type="dxa" w:w="1377"/>
             <w:shd w:val="clear" w:color="auto" w:fill="F5F0E8"/>
           </w:tcPr>
           <w:p>
@@ -3183,7 +3165,7 @@
         </w:tc>
         <w:tc>
           <w:tcPr>
-            <w:tcW w:type="dxa" w:w="1344"/>
+            <w:tcW w:type="dxa" w:w="1377"/>
             <w:shd w:val="clear" w:color="auto" w:fill="F5F0E8"/>
           </w:tcPr>
           <w:p>
@@ -3205,7 +3187,7 @@
         </w:tc>
         <w:tc>
           <w:tcPr>
-            <w:tcW w:type="dxa" w:w="1344"/>
+            <w:tcW w:type="dxa" w:w="1377"/>
             <w:shd w:val="clear" w:color="auto" w:fill="F5F0E8"/>
           </w:tcPr>
           <w:p>
@@ -3227,7 +3209,7 @@
         </w:tc>
         <w:tc>
           <w:tcPr>
-            <w:tcW w:type="dxa" w:w="1344"/>
+            <w:tcW w:type="dxa" w:w="1377"/>
             <w:shd w:val="clear" w:color="auto" w:fill="F5F0E8"/>
           </w:tcPr>
           <w:p>
@@ -3243,13 +3225,13 @@
                 <w:i w:val="0"/>
                 <w:sz w:val="18"/>
               </w:rPr>
-              <w:t>0.9549</w:t>
+              <w:t>0.9548</w:t>
             </w:r>
           </w:p>
         </w:tc>
         <w:tc>
           <w:tcPr>
-            <w:tcW w:type="dxa" w:w="1344"/>
+            <w:tcW w:type="dxa" w:w="1377"/>
             <w:shd w:val="clear" w:color="auto" w:fill="F5F0E8"/>
           </w:tcPr>
           <w:p>
@@ -3273,7 +3255,7 @@
       <w:tr>
         <w:tc>
           <w:tcPr>
-            <w:tcW w:type="dxa" w:w="1344"/>
+            <w:tcW w:type="dxa" w:w="1377"/>
             <w:shd w:val="clear" w:color="auto" w:fill="FFFFFF"/>
           </w:tcPr>
           <w:p>
@@ -3295,7 +3277,7 @@
         </w:tc>
         <w:tc>
           <w:tcPr>
-            <w:tcW w:type="dxa" w:w="1344"/>
+            <w:tcW w:type="dxa" w:w="1377"/>
             <w:shd w:val="clear" w:color="auto" w:fill="FFFFFF"/>
           </w:tcPr>
           <w:p>
@@ -3317,7 +3299,7 @@
         </w:tc>
         <w:tc>
           <w:tcPr>
-            <w:tcW w:type="dxa" w:w="1344"/>
+            <w:tcW w:type="dxa" w:w="1377"/>
             <w:shd w:val="clear" w:color="auto" w:fill="FFFFFF"/>
           </w:tcPr>
           <w:p>
@@ -3339,7 +3321,7 @@
         </w:tc>
         <w:tc>
           <w:tcPr>
-            <w:tcW w:type="dxa" w:w="1344"/>
+            <w:tcW w:type="dxa" w:w="1377"/>
             <w:shd w:val="clear" w:color="auto" w:fill="FFFFFF"/>
           </w:tcPr>
           <w:p>
@@ -3361,7 +3343,7 @@
         </w:tc>
         <w:tc>
           <w:tcPr>
-            <w:tcW w:type="dxa" w:w="1344"/>
+            <w:tcW w:type="dxa" w:w="1377"/>
             <w:shd w:val="clear" w:color="auto" w:fill="FFFFFF"/>
           </w:tcPr>
           <w:p>
@@ -3383,7 +3365,7 @@
         </w:tc>
         <w:tc>
           <w:tcPr>
-            <w:tcW w:type="dxa" w:w="1344"/>
+            <w:tcW w:type="dxa" w:w="1377"/>
             <w:shd w:val="clear" w:color="auto" w:fill="FFFFFF"/>
           </w:tcPr>
           <w:p>
@@ -3399,13 +3381,13 @@
                 <w:i w:val="0"/>
                 <w:sz w:val="18"/>
               </w:rPr>
-              <w:t>0.9537</w:t>
+              <w:t>0.9542</w:t>
             </w:r>
           </w:p>
         </w:tc>
         <w:tc>
           <w:tcPr>
-            <w:tcW w:type="dxa" w:w="1344"/>
+            <w:tcW w:type="dxa" w:w="1377"/>
             <w:shd w:val="clear" w:color="auto" w:fill="FFFFFF"/>
           </w:tcPr>
           <w:p>
@@ -3429,7 +3411,7 @@
       <w:tr>
         <w:tc>
           <w:tcPr>
-            <w:tcW w:type="dxa" w:w="1344"/>
+            <w:tcW w:type="dxa" w:w="1377"/>
             <w:shd w:val="clear" w:color="auto" w:fill="F5F0E8"/>
           </w:tcPr>
           <w:p>
@@ -3451,7 +3433,7 @@
         </w:tc>
         <w:tc>
           <w:tcPr>
-            <w:tcW w:type="dxa" w:w="1344"/>
+            <w:tcW w:type="dxa" w:w="1377"/>
             <w:shd w:val="clear" w:color="auto" w:fill="F5F0E8"/>
           </w:tcPr>
           <w:p>
@@ -3473,7 +3455,7 @@
         </w:tc>
         <w:tc>
           <w:tcPr>
-            <w:tcW w:type="dxa" w:w="1344"/>
+            <w:tcW w:type="dxa" w:w="1377"/>
             <w:shd w:val="clear" w:color="auto" w:fill="F5F0E8"/>
           </w:tcPr>
           <w:p>
@@ -3495,7 +3477,7 @@
         </w:tc>
         <w:tc>
           <w:tcPr>
-            <w:tcW w:type="dxa" w:w="1344"/>
+            <w:tcW w:type="dxa" w:w="1377"/>
             <w:shd w:val="clear" w:color="auto" w:fill="F5F0E8"/>
           </w:tcPr>
           <w:p>
@@ -3517,7 +3499,7 @@
         </w:tc>
         <w:tc>
           <w:tcPr>
-            <w:tcW w:type="dxa" w:w="1344"/>
+            <w:tcW w:type="dxa" w:w="1377"/>
             <w:shd w:val="clear" w:color="auto" w:fill="F5F0E8"/>
           </w:tcPr>
           <w:p>
@@ -3539,7 +3521,7 @@
         </w:tc>
         <w:tc>
           <w:tcPr>
-            <w:tcW w:type="dxa" w:w="1344"/>
+            <w:tcW w:type="dxa" w:w="1377"/>
             <w:shd w:val="clear" w:color="auto" w:fill="F5F0E8"/>
           </w:tcPr>
           <w:p>
@@ -3561,7 +3543,7 @@
         </w:tc>
         <w:tc>
           <w:tcPr>
-            <w:tcW w:type="dxa" w:w="1344"/>
+            <w:tcW w:type="dxa" w:w="1377"/>
             <w:shd w:val="clear" w:color="auto" w:fill="F5F0E8"/>
           </w:tcPr>
           <w:p>
@@ -3585,7 +3567,7 @@
       <w:tr>
         <w:tc>
           <w:tcPr>
-            <w:tcW w:type="dxa" w:w="1344"/>
+            <w:tcW w:type="dxa" w:w="1377"/>
             <w:shd w:val="clear" w:color="auto" w:fill="FFFFFF"/>
           </w:tcPr>
           <w:p>
@@ -3607,7 +3589,7 @@
         </w:tc>
         <w:tc>
           <w:tcPr>
-            <w:tcW w:type="dxa" w:w="1344"/>
+            <w:tcW w:type="dxa" w:w="1377"/>
             <w:shd w:val="clear" w:color="auto" w:fill="FFFFFF"/>
           </w:tcPr>
           <w:p>
@@ -3629,7 +3611,7 @@
         </w:tc>
         <w:tc>
           <w:tcPr>
-            <w:tcW w:type="dxa" w:w="1344"/>
+            <w:tcW w:type="dxa" w:w="1377"/>
             <w:shd w:val="clear" w:color="auto" w:fill="FFFFFF"/>
           </w:tcPr>
           <w:p>
@@ -3651,7 +3633,7 @@
         </w:tc>
         <w:tc>
           <w:tcPr>
-            <w:tcW w:type="dxa" w:w="1344"/>
+            <w:tcW w:type="dxa" w:w="1377"/>
             <w:shd w:val="clear" w:color="auto" w:fill="FFFFFF"/>
           </w:tcPr>
           <w:p>
@@ -3673,7 +3655,7 @@
         </w:tc>
         <w:tc>
           <w:tcPr>
-            <w:tcW w:type="dxa" w:w="1344"/>
+            <w:tcW w:type="dxa" w:w="1377"/>
             <w:shd w:val="clear" w:color="auto" w:fill="FFFFFF"/>
           </w:tcPr>
           <w:p>
@@ -3695,7 +3677,7 @@
         </w:tc>
         <w:tc>
           <w:tcPr>
-            <w:tcW w:type="dxa" w:w="1344"/>
+            <w:tcW w:type="dxa" w:w="1377"/>
             <w:shd w:val="clear" w:color="auto" w:fill="FFFFFF"/>
           </w:tcPr>
           <w:p>
@@ -3717,7 +3699,7 @@
         </w:tc>
         <w:tc>
           <w:tcPr>
-            <w:tcW w:type="dxa" w:w="1344"/>
+            <w:tcW w:type="dxa" w:w="1377"/>
             <w:shd w:val="clear" w:color="auto" w:fill="FFFFFF"/>
           </w:tcPr>
           <w:p>
@@ -3741,7 +3723,7 @@
       <w:tr>
         <w:tc>
           <w:tcPr>
-            <w:tcW w:type="dxa" w:w="1344"/>
+            <w:tcW w:type="dxa" w:w="1377"/>
             <w:shd w:val="clear" w:color="auto" w:fill="F5F0E8"/>
           </w:tcPr>
           <w:p>
@@ -3763,7 +3745,7 @@
         </w:tc>
         <w:tc>
           <w:tcPr>
-            <w:tcW w:type="dxa" w:w="1344"/>
+            <w:tcW w:type="dxa" w:w="1377"/>
             <w:shd w:val="clear" w:color="auto" w:fill="F5F0E8"/>
           </w:tcPr>
           <w:p>
@@ -3785,7 +3767,7 @@
         </w:tc>
         <w:tc>
           <w:tcPr>
-            <w:tcW w:type="dxa" w:w="1344"/>
+            <w:tcW w:type="dxa" w:w="1377"/>
             <w:shd w:val="clear" w:color="auto" w:fill="F5F0E8"/>
           </w:tcPr>
           <w:p>
@@ -3807,7 +3789,7 @@
         </w:tc>
         <w:tc>
           <w:tcPr>
-            <w:tcW w:type="dxa" w:w="1344"/>
+            <w:tcW w:type="dxa" w:w="1377"/>
             <w:shd w:val="clear" w:color="auto" w:fill="F5F0E8"/>
           </w:tcPr>
           <w:p>
@@ -3829,7 +3811,7 @@
         </w:tc>
         <w:tc>
           <w:tcPr>
-            <w:tcW w:type="dxa" w:w="1344"/>
+            <w:tcW w:type="dxa" w:w="1377"/>
             <w:shd w:val="clear" w:color="auto" w:fill="F5F0E8"/>
           </w:tcPr>
           <w:p>
@@ -3851,7 +3833,7 @@
         </w:tc>
         <w:tc>
           <w:tcPr>
-            <w:tcW w:type="dxa" w:w="1344"/>
+            <w:tcW w:type="dxa" w:w="1377"/>
             <w:shd w:val="clear" w:color="auto" w:fill="F5F0E8"/>
           </w:tcPr>
           <w:p>
@@ -3873,7 +3855,7 @@
         </w:tc>
         <w:tc>
           <w:tcPr>
-            <w:tcW w:type="dxa" w:w="1344"/>
+            <w:tcW w:type="dxa" w:w="1377"/>
             <w:shd w:val="clear" w:color="auto" w:fill="F5F0E8"/>
           </w:tcPr>
           <w:p>
@@ -3897,7 +3879,7 @@
       <w:tr>
         <w:tc>
           <w:tcPr>
-            <w:tcW w:type="dxa" w:w="1344"/>
+            <w:tcW w:type="dxa" w:w="1377"/>
             <w:shd w:val="clear" w:color="auto" w:fill="FFFFFF"/>
           </w:tcPr>
           <w:p>
@@ -3919,7 +3901,7 @@
         </w:tc>
         <w:tc>
           <w:tcPr>
-            <w:tcW w:type="dxa" w:w="1344"/>
+            <w:tcW w:type="dxa" w:w="1377"/>
             <w:shd w:val="clear" w:color="auto" w:fill="FFFFFF"/>
           </w:tcPr>
           <w:p>
@@ -3941,7 +3923,7 @@
         </w:tc>
         <w:tc>
           <w:tcPr>
-            <w:tcW w:type="dxa" w:w="1344"/>
+            <w:tcW w:type="dxa" w:w="1377"/>
             <w:shd w:val="clear" w:color="auto" w:fill="FFFFFF"/>
           </w:tcPr>
           <w:p>
@@ -3963,7 +3945,7 @@
         </w:tc>
         <w:tc>
           <w:tcPr>
-            <w:tcW w:type="dxa" w:w="1344"/>
+            <w:tcW w:type="dxa" w:w="1377"/>
             <w:shd w:val="clear" w:color="auto" w:fill="FFFFFF"/>
           </w:tcPr>
           <w:p>
@@ -3985,7 +3967,7 @@
         </w:tc>
         <w:tc>
           <w:tcPr>
-            <w:tcW w:type="dxa" w:w="1344"/>
+            <w:tcW w:type="dxa" w:w="1377"/>
             <w:shd w:val="clear" w:color="auto" w:fill="FFFFFF"/>
           </w:tcPr>
           <w:p>
@@ -4007,7 +3989,7 @@
         </w:tc>
         <w:tc>
           <w:tcPr>
-            <w:tcW w:type="dxa" w:w="1344"/>
+            <w:tcW w:type="dxa" w:w="1377"/>
             <w:shd w:val="clear" w:color="auto" w:fill="FFFFFF"/>
           </w:tcPr>
           <w:p>
@@ -4029,7 +4011,7 @@
         </w:tc>
         <w:tc>
           <w:tcPr>
-            <w:tcW w:type="dxa" w:w="1344"/>
+            <w:tcW w:type="dxa" w:w="1377"/>
             <w:shd w:val="clear" w:color="auto" w:fill="FFFFFF"/>
           </w:tcPr>
           <w:p>
@@ -4053,7 +4035,7 @@
       <w:tr>
         <w:tc>
           <w:tcPr>
-            <w:tcW w:type="dxa" w:w="1344"/>
+            <w:tcW w:type="dxa" w:w="1377"/>
             <w:shd w:val="clear" w:color="auto" w:fill="F5F0E8"/>
           </w:tcPr>
           <w:p>
@@ -4075,7 +4057,7 @@
         </w:tc>
         <w:tc>
           <w:tcPr>
-            <w:tcW w:type="dxa" w:w="1344"/>
+            <w:tcW w:type="dxa" w:w="1377"/>
             <w:shd w:val="clear" w:color="auto" w:fill="F5F0E8"/>
           </w:tcPr>
           <w:p>
@@ -4097,7 +4079,7 @@
         </w:tc>
         <w:tc>
           <w:tcPr>
-            <w:tcW w:type="dxa" w:w="1344"/>
+            <w:tcW w:type="dxa" w:w="1377"/>
             <w:shd w:val="clear" w:color="auto" w:fill="F5F0E8"/>
           </w:tcPr>
           <w:p>
@@ -4119,7 +4101,7 @@
         </w:tc>
         <w:tc>
           <w:tcPr>
-            <w:tcW w:type="dxa" w:w="1344"/>
+            <w:tcW w:type="dxa" w:w="1377"/>
             <w:shd w:val="clear" w:color="auto" w:fill="F5F0E8"/>
           </w:tcPr>
           <w:p>
@@ -4141,7 +4123,7 @@
         </w:tc>
         <w:tc>
           <w:tcPr>
-            <w:tcW w:type="dxa" w:w="1344"/>
+            <w:tcW w:type="dxa" w:w="1377"/>
             <w:shd w:val="clear" w:color="auto" w:fill="F5F0E8"/>
           </w:tcPr>
           <w:p>
@@ -4163,7 +4145,7 @@
         </w:tc>
         <w:tc>
           <w:tcPr>
-            <w:tcW w:type="dxa" w:w="1344"/>
+            <w:tcW w:type="dxa" w:w="1377"/>
             <w:shd w:val="clear" w:color="auto" w:fill="F5F0E8"/>
           </w:tcPr>
           <w:p>
@@ -4185,7 +4167,7 @@
         </w:tc>
         <w:tc>
           <w:tcPr>
-            <w:tcW w:type="dxa" w:w="1344"/>
+            <w:tcW w:type="dxa" w:w="1377"/>
             <w:shd w:val="clear" w:color="auto" w:fill="F5F0E8"/>
           </w:tcPr>
           <w:p>
@@ -4209,7 +4191,7 @@
       <w:tr>
         <w:tc>
           <w:tcPr>
-            <w:tcW w:type="dxa" w:w="1344"/>
+            <w:tcW w:type="dxa" w:w="1377"/>
             <w:shd w:val="clear" w:color="auto" w:fill="FFFFFF"/>
           </w:tcPr>
           <w:p>
@@ -4231,7 +4213,7 @@
         </w:tc>
         <w:tc>
           <w:tcPr>
-            <w:tcW w:type="dxa" w:w="1344"/>
+            <w:tcW w:type="dxa" w:w="1377"/>
             <w:shd w:val="clear" w:color="auto" w:fill="FFFFFF"/>
           </w:tcPr>
           <w:p>
@@ -4253,7 +4235,7 @@
         </w:tc>
         <w:tc>
           <w:tcPr>
-            <w:tcW w:type="dxa" w:w="1344"/>
+            <w:tcW w:type="dxa" w:w="1377"/>
             <w:shd w:val="clear" w:color="auto" w:fill="FFFFFF"/>
           </w:tcPr>
           <w:p>
@@ -4275,7 +4257,7 @@
         </w:tc>
         <w:tc>
           <w:tcPr>
-            <w:tcW w:type="dxa" w:w="1344"/>
+            <w:tcW w:type="dxa" w:w="1377"/>
             <w:shd w:val="clear" w:color="auto" w:fill="FFFFFF"/>
           </w:tcPr>
           <w:p>
@@ -4297,7 +4279,7 @@
         </w:tc>
         <w:tc>
           <w:tcPr>
-            <w:tcW w:type="dxa" w:w="1344"/>
+            <w:tcW w:type="dxa" w:w="1377"/>
             <w:shd w:val="clear" w:color="auto" w:fill="FFFFFF"/>
           </w:tcPr>
           <w:p>
@@ -4319,7 +4301,7 @@
         </w:tc>
         <w:tc>
           <w:tcPr>
-            <w:tcW w:type="dxa" w:w="1344"/>
+            <w:tcW w:type="dxa" w:w="1377"/>
             <w:shd w:val="clear" w:color="auto" w:fill="FFFFFF"/>
           </w:tcPr>
           <w:p>
@@ -4341,7 +4323,7 @@
         </w:tc>
         <w:tc>
           <w:tcPr>
-            <w:tcW w:type="dxa" w:w="1344"/>
+            <w:tcW w:type="dxa" w:w="1377"/>
             <w:shd w:val="clear" w:color="auto" w:fill="FFFFFF"/>
           </w:tcPr>
           <w:p>
@@ -4365,7 +4347,7 @@
       <w:tr>
         <w:tc>
           <w:tcPr>
-            <w:tcW w:type="dxa" w:w="1344"/>
+            <w:tcW w:type="dxa" w:w="1377"/>
             <w:shd w:val="clear" w:color="auto" w:fill="F5F0E8"/>
           </w:tcPr>
           <w:p>
@@ -4387,7 +4369,7 @@
         </w:tc>
         <w:tc>
           <w:tcPr>
-            <w:tcW w:type="dxa" w:w="1344"/>
+            <w:tcW w:type="dxa" w:w="1377"/>
             <w:shd w:val="clear" w:color="auto" w:fill="F5F0E8"/>
           </w:tcPr>
           <w:p>
@@ -4409,7 +4391,7 @@
         </w:tc>
         <w:tc>
           <w:tcPr>
-            <w:tcW w:type="dxa" w:w="1344"/>
+            <w:tcW w:type="dxa" w:w="1377"/>
             <w:shd w:val="clear" w:color="auto" w:fill="F5F0E8"/>
           </w:tcPr>
           <w:p>
@@ -4431,7 +4413,7 @@
         </w:tc>
         <w:tc>
           <w:tcPr>
-            <w:tcW w:type="dxa" w:w="1344"/>
+            <w:tcW w:type="dxa" w:w="1377"/>
             <w:shd w:val="clear" w:color="auto" w:fill="F5F0E8"/>
           </w:tcPr>
           <w:p>
@@ -4453,7 +4435,7 @@
         </w:tc>
         <w:tc>
           <w:tcPr>
-            <w:tcW w:type="dxa" w:w="1344"/>
+            <w:tcW w:type="dxa" w:w="1377"/>
             <w:shd w:val="clear" w:color="auto" w:fill="F5F0E8"/>
           </w:tcPr>
           <w:p>
@@ -4475,7 +4457,7 @@
         </w:tc>
         <w:tc>
           <w:tcPr>
-            <w:tcW w:type="dxa" w:w="1344"/>
+            <w:tcW w:type="dxa" w:w="1377"/>
             <w:shd w:val="clear" w:color="auto" w:fill="F5F0E8"/>
           </w:tcPr>
           <w:p>
@@ -4497,7 +4479,7 @@
         </w:tc>
         <w:tc>
           <w:tcPr>
-            <w:tcW w:type="dxa" w:w="1344"/>
+            <w:tcW w:type="dxa" w:w="1377"/>
             <w:shd w:val="clear" w:color="auto" w:fill="F5F0E8"/>
           </w:tcPr>
           <w:p>
@@ -4521,7 +4503,7 @@
       <w:tr>
         <w:tc>
           <w:tcPr>
-            <w:tcW w:type="dxa" w:w="1344"/>
+            <w:tcW w:type="dxa" w:w="1377"/>
             <w:shd w:val="clear" w:color="auto" w:fill="FFFFFF"/>
           </w:tcPr>
           <w:p>
@@ -4543,7 +4525,7 @@
         </w:tc>
         <w:tc>
           <w:tcPr>
-            <w:tcW w:type="dxa" w:w="1344"/>
+            <w:tcW w:type="dxa" w:w="1377"/>
             <w:shd w:val="clear" w:color="auto" w:fill="FFFFFF"/>
           </w:tcPr>
           <w:p>
@@ -4565,7 +4547,7 @@
         </w:tc>
         <w:tc>
           <w:tcPr>
-            <w:tcW w:type="dxa" w:w="1344"/>
+            <w:tcW w:type="dxa" w:w="1377"/>
             <w:shd w:val="clear" w:color="auto" w:fill="FFFFFF"/>
           </w:tcPr>
           <w:p>
@@ -4587,7 +4569,7 @@
         </w:tc>
         <w:tc>
           <w:tcPr>
-            <w:tcW w:type="dxa" w:w="1344"/>
+            <w:tcW w:type="dxa" w:w="1377"/>
             <w:shd w:val="clear" w:color="auto" w:fill="FFFFFF"/>
           </w:tcPr>
           <w:p>
@@ -4609,7 +4591,7 @@
         </w:tc>
         <w:tc>
           <w:tcPr>
-            <w:tcW w:type="dxa" w:w="1344"/>
+            <w:tcW w:type="dxa" w:w="1377"/>
             <w:shd w:val="clear" w:color="auto" w:fill="FFFFFF"/>
           </w:tcPr>
           <w:p>
@@ -4631,7 +4613,7 @@
         </w:tc>
         <w:tc>
           <w:tcPr>
-            <w:tcW w:type="dxa" w:w="1344"/>
+            <w:tcW w:type="dxa" w:w="1377"/>
             <w:shd w:val="clear" w:color="auto" w:fill="FFFFFF"/>
           </w:tcPr>
           <w:p>
@@ -4653,7 +4635,7 @@
         </w:tc>
         <w:tc>
           <w:tcPr>
-            <w:tcW w:type="dxa" w:w="1344"/>
+            <w:tcW w:type="dxa" w:w="1377"/>
             <w:shd w:val="clear" w:color="auto" w:fill="FFFFFF"/>
           </w:tcPr>
           <w:p>
@@ -4677,7 +4659,7 @@
       <w:tr>
         <w:tc>
           <w:tcPr>
-            <w:tcW w:type="dxa" w:w="1344"/>
+            <w:tcW w:type="dxa" w:w="1377"/>
             <w:shd w:val="clear" w:color="auto" w:fill="F5F0E8"/>
           </w:tcPr>
           <w:p>
@@ -4699,7 +4681,7 @@
         </w:tc>
         <w:tc>
           <w:tcPr>
-            <w:tcW w:type="dxa" w:w="1344"/>
+            <w:tcW w:type="dxa" w:w="1377"/>
             <w:shd w:val="clear" w:color="auto" w:fill="F5F0E8"/>
           </w:tcPr>
           <w:p>
@@ -4721,7 +4703,7 @@
         </w:tc>
         <w:tc>
           <w:tcPr>
-            <w:tcW w:type="dxa" w:w="1344"/>
+            <w:tcW w:type="dxa" w:w="1377"/>
             <w:shd w:val="clear" w:color="auto" w:fill="F5F0E8"/>
           </w:tcPr>
           <w:p>
@@ -4743,7 +4725,7 @@
         </w:tc>
         <w:tc>
           <w:tcPr>
-            <w:tcW w:type="dxa" w:w="1344"/>
+            <w:tcW w:type="dxa" w:w="1377"/>
             <w:shd w:val="clear" w:color="auto" w:fill="F5F0E8"/>
           </w:tcPr>
           <w:p>
@@ -4765,7 +4747,7 @@
         </w:tc>
         <w:tc>
           <w:tcPr>
-            <w:tcW w:type="dxa" w:w="1344"/>
+            <w:tcW w:type="dxa" w:w="1377"/>
             <w:shd w:val="clear" w:color="auto" w:fill="F5F0E8"/>
           </w:tcPr>
           <w:p>
@@ -4787,7 +4769,7 @@
         </w:tc>
         <w:tc>
           <w:tcPr>
-            <w:tcW w:type="dxa" w:w="1344"/>
+            <w:tcW w:type="dxa" w:w="1377"/>
             <w:shd w:val="clear" w:color="auto" w:fill="F5F0E8"/>
           </w:tcPr>
           <w:p>
@@ -4809,7 +4791,7 @@
         </w:tc>
         <w:tc>
           <w:tcPr>
-            <w:tcW w:type="dxa" w:w="1344"/>
+            <w:tcW w:type="dxa" w:w="1377"/>
             <w:shd w:val="clear" w:color="auto" w:fill="F5F0E8"/>
           </w:tcPr>
           <w:p>
@@ -5040,7 +5022,7 @@
           <w:i/>
           <w:sz w:val="22"/>
         </w:rPr>
-        <w:t>4.2. ML versus DL: Where Does the Improvement Come From?</w:t>
+        <w:t>3.2. ML versus DL: Where Does the Improvement Come From?</w:t>
       </w:r>
     </w:p>
     <w:p>
@@ -5056,7 +5038,7 @@
           <w:i w:val="0"/>
           <w:sz w:val="22"/>
         </w:rPr>
-        <w:t>Figure 7 contrasts the two families directly. The seven ML classifiers reach a mean ROC-AUC of 0.9275, while the four DL architectures reach 0.9197 — but only because the 1D-CNN drags the DL mean down. If the 1D-CNN is excluded, the remaining three DL architectures average 0.9449, narrowly higher than the ML mean of 0.9276 when Logistic Regression is excluded. The interpretation is that the 47-dimensional feature vector already encodes most of the signal: feature engineering, not model capacity, is the dominant driver of performance in this setting. Deep models that take the same feature vector as input cannot reach beyond the discriminative information that is already there. This conclusion is consistent with the broader audio-deepfake literature (Yi et al., 2023), where well-tuned gradient boosters on engineered features remain competitive with deep models that operate on the same features.</w:t>
+        <w:t>Figure 7 contrasts the two families directly. The seven ML classifiers reach a mean ROC-AUC of 0.9275, while the four DL architectures reach 0.9232 — but only because the 1D-CNN drags the DL mean down. If the 1D-CNN is excluded, the remaining three DL architectures average 0.9462, narrowly higher than the ML mean of 0.9402 when Logistic Regression is excluded. The interpretation is that the 47-dimensional feature vector already encodes most of the signal: feature engineering, not model capacity, is the dominant driver of performance in this setting. Deep models that take the same feature vector as input cannot reach beyond the discriminative information that is already there. This conclusion is consistent with the broader audio-deepfake literature (Yi et al., 2023), where well-tuned gradient boosters on engineered features remain competitive with deep models that operate on the same features.</w:t>
       </w:r>
     </w:p>
     <w:p>
@@ -5133,7 +5115,7 @@
           <w:i/>
           <w:sz w:val="22"/>
         </w:rPr>
-        <w:t>4.3. Cross-Fold Stability</w:t>
+        <w:t>3.3. Cross-Fold Stability</w:t>
       </w:r>
     </w:p>
     <w:p>
@@ -5159,19 +5141,19 @@
         <w:tblLook w:firstColumn="1" w:firstRow="1" w:lastColumn="0" w:lastRow="0" w:noHBand="0" w:noVBand="1" w:val="04A0"/>
       </w:tblPr>
       <w:tblGrid>
-        <w:gridCol w:w="1176"/>
-        <w:gridCol w:w="1176"/>
-        <w:gridCol w:w="1176"/>
-        <w:gridCol w:w="1176"/>
-        <w:gridCol w:w="1176"/>
-        <w:gridCol w:w="1176"/>
-        <w:gridCol w:w="1176"/>
-        <w:gridCol w:w="1176"/>
+        <w:gridCol w:w="1205"/>
+        <w:gridCol w:w="1205"/>
+        <w:gridCol w:w="1205"/>
+        <w:gridCol w:w="1205"/>
+        <w:gridCol w:w="1205"/>
+        <w:gridCol w:w="1205"/>
+        <w:gridCol w:w="1205"/>
+        <w:gridCol w:w="1205"/>
       </w:tblGrid>
       <w:tr>
         <w:tc>
           <w:tcPr>
-            <w:tcW w:type="dxa" w:w="1176"/>
+            <w:tcW w:type="dxa" w:w="1205"/>
             <w:shd w:val="clear" w:color="auto" w:fill="C99347"/>
           </w:tcPr>
           <w:p>
@@ -5193,7 +5175,7 @@
         </w:tc>
         <w:tc>
           <w:tcPr>
-            <w:tcW w:type="dxa" w:w="1176"/>
+            <w:tcW w:type="dxa" w:w="1205"/>
             <w:shd w:val="clear" w:color="auto" w:fill="C99347"/>
           </w:tcPr>
           <w:p>
@@ -5215,7 +5197,7 @@
         </w:tc>
         <w:tc>
           <w:tcPr>
-            <w:tcW w:type="dxa" w:w="1176"/>
+            <w:tcW w:type="dxa" w:w="1205"/>
             <w:shd w:val="clear" w:color="auto" w:fill="C99347"/>
           </w:tcPr>
           <w:p>
@@ -5237,7 +5219,7 @@
         </w:tc>
         <w:tc>
           <w:tcPr>
-            <w:tcW w:type="dxa" w:w="1176"/>
+            <w:tcW w:type="dxa" w:w="1205"/>
             <w:shd w:val="clear" w:color="auto" w:fill="C99347"/>
           </w:tcPr>
           <w:p>
@@ -5259,7 +5241,7 @@
         </w:tc>
         <w:tc>
           <w:tcPr>
-            <w:tcW w:type="dxa" w:w="1176"/>
+            <w:tcW w:type="dxa" w:w="1205"/>
             <w:shd w:val="clear" w:color="auto" w:fill="C99347"/>
           </w:tcPr>
           <w:p>
@@ -5281,7 +5263,7 @@
         </w:tc>
         <w:tc>
           <w:tcPr>
-            <w:tcW w:type="dxa" w:w="1176"/>
+            <w:tcW w:type="dxa" w:w="1205"/>
             <w:shd w:val="clear" w:color="auto" w:fill="C99347"/>
           </w:tcPr>
           <w:p>
@@ -5303,7 +5285,7 @@
         </w:tc>
         <w:tc>
           <w:tcPr>
-            <w:tcW w:type="dxa" w:w="1176"/>
+            <w:tcW w:type="dxa" w:w="1205"/>
             <w:shd w:val="clear" w:color="auto" w:fill="C99347"/>
           </w:tcPr>
           <w:p>
@@ -5325,7 +5307,7 @@
         </w:tc>
         <w:tc>
           <w:tcPr>
-            <w:tcW w:type="dxa" w:w="1176"/>
+            <w:tcW w:type="dxa" w:w="1205"/>
             <w:shd w:val="clear" w:color="auto" w:fill="C99347"/>
           </w:tcPr>
           <w:p>
@@ -5349,7 +5331,7 @@
       <w:tr>
         <w:tc>
           <w:tcPr>
-            <w:tcW w:type="dxa" w:w="1176"/>
+            <w:tcW w:type="dxa" w:w="1205"/>
             <w:shd w:val="clear" w:color="auto" w:fill="F5F0E8"/>
           </w:tcPr>
           <w:p>
@@ -5371,7 +5353,7 @@
         </w:tc>
         <w:tc>
           <w:tcPr>
-            <w:tcW w:type="dxa" w:w="1176"/>
+            <w:tcW w:type="dxa" w:w="1205"/>
             <w:shd w:val="clear" w:color="auto" w:fill="F5F0E8"/>
           </w:tcPr>
           <w:p>
@@ -5393,7 +5375,7 @@
         </w:tc>
         <w:tc>
           <w:tcPr>
-            <w:tcW w:type="dxa" w:w="1176"/>
+            <w:tcW w:type="dxa" w:w="1205"/>
             <w:shd w:val="clear" w:color="auto" w:fill="F5F0E8"/>
           </w:tcPr>
           <w:p>
@@ -5415,7 +5397,7 @@
         </w:tc>
         <w:tc>
           <w:tcPr>
-            <w:tcW w:type="dxa" w:w="1176"/>
+            <w:tcW w:type="dxa" w:w="1205"/>
             <w:shd w:val="clear" w:color="auto" w:fill="F5F0E8"/>
           </w:tcPr>
           <w:p>
@@ -5437,7 +5419,7 @@
         </w:tc>
         <w:tc>
           <w:tcPr>
-            <w:tcW w:type="dxa" w:w="1176"/>
+            <w:tcW w:type="dxa" w:w="1205"/>
             <w:shd w:val="clear" w:color="auto" w:fill="F5F0E8"/>
           </w:tcPr>
           <w:p>
@@ -5459,7 +5441,7 @@
         </w:tc>
         <w:tc>
           <w:tcPr>
-            <w:tcW w:type="dxa" w:w="1176"/>
+            <w:tcW w:type="dxa" w:w="1205"/>
             <w:shd w:val="clear" w:color="auto" w:fill="F5F0E8"/>
           </w:tcPr>
           <w:p>
@@ -5481,7 +5463,7 @@
         </w:tc>
         <w:tc>
           <w:tcPr>
-            <w:tcW w:type="dxa" w:w="1176"/>
+            <w:tcW w:type="dxa" w:w="1205"/>
             <w:shd w:val="clear" w:color="auto" w:fill="F5F0E8"/>
           </w:tcPr>
           <w:p>
@@ -5503,7 +5485,7 @@
         </w:tc>
         <w:tc>
           <w:tcPr>
-            <w:tcW w:type="dxa" w:w="1176"/>
+            <w:tcW w:type="dxa" w:w="1205"/>
             <w:shd w:val="clear" w:color="auto" w:fill="F5F0E8"/>
           </w:tcPr>
           <w:p>
@@ -5527,7 +5509,7 @@
       <w:tr>
         <w:tc>
           <w:tcPr>
-            <w:tcW w:type="dxa" w:w="1176"/>
+            <w:tcW w:type="dxa" w:w="1205"/>
             <w:shd w:val="clear" w:color="auto" w:fill="FFFFFF"/>
           </w:tcPr>
           <w:p>
@@ -5549,7 +5531,7 @@
         </w:tc>
         <w:tc>
           <w:tcPr>
-            <w:tcW w:type="dxa" w:w="1176"/>
+            <w:tcW w:type="dxa" w:w="1205"/>
             <w:shd w:val="clear" w:color="auto" w:fill="FFFFFF"/>
           </w:tcPr>
           <w:p>
@@ -5571,7 +5553,7 @@
         </w:tc>
         <w:tc>
           <w:tcPr>
-            <w:tcW w:type="dxa" w:w="1176"/>
+            <w:tcW w:type="dxa" w:w="1205"/>
             <w:shd w:val="clear" w:color="auto" w:fill="FFFFFF"/>
           </w:tcPr>
           <w:p>
@@ -5593,7 +5575,7 @@
         </w:tc>
         <w:tc>
           <w:tcPr>
-            <w:tcW w:type="dxa" w:w="1176"/>
+            <w:tcW w:type="dxa" w:w="1205"/>
             <w:shd w:val="clear" w:color="auto" w:fill="FFFFFF"/>
           </w:tcPr>
           <w:p>
@@ -5615,7 +5597,7 @@
         </w:tc>
         <w:tc>
           <w:tcPr>
-            <w:tcW w:type="dxa" w:w="1176"/>
+            <w:tcW w:type="dxa" w:w="1205"/>
             <w:shd w:val="clear" w:color="auto" w:fill="FFFFFF"/>
           </w:tcPr>
           <w:p>
@@ -5637,7 +5619,7 @@
         </w:tc>
         <w:tc>
           <w:tcPr>
-            <w:tcW w:type="dxa" w:w="1176"/>
+            <w:tcW w:type="dxa" w:w="1205"/>
             <w:shd w:val="clear" w:color="auto" w:fill="FFFFFF"/>
           </w:tcPr>
           <w:p>
@@ -5659,7 +5641,7 @@
         </w:tc>
         <w:tc>
           <w:tcPr>
-            <w:tcW w:type="dxa" w:w="1176"/>
+            <w:tcW w:type="dxa" w:w="1205"/>
             <w:shd w:val="clear" w:color="auto" w:fill="FFFFFF"/>
           </w:tcPr>
           <w:p>
@@ -5681,7 +5663,7 @@
         </w:tc>
         <w:tc>
           <w:tcPr>
-            <w:tcW w:type="dxa" w:w="1176"/>
+            <w:tcW w:type="dxa" w:w="1205"/>
             <w:shd w:val="clear" w:color="auto" w:fill="FFFFFF"/>
           </w:tcPr>
           <w:p>
@@ -5705,7 +5687,7 @@
       <w:tr>
         <w:tc>
           <w:tcPr>
-            <w:tcW w:type="dxa" w:w="1176"/>
+            <w:tcW w:type="dxa" w:w="1205"/>
             <w:shd w:val="clear" w:color="auto" w:fill="F5F0E8"/>
           </w:tcPr>
           <w:p>
@@ -5727,7 +5709,7 @@
         </w:tc>
         <w:tc>
           <w:tcPr>
-            <w:tcW w:type="dxa" w:w="1176"/>
+            <w:tcW w:type="dxa" w:w="1205"/>
             <w:shd w:val="clear" w:color="auto" w:fill="F5F0E8"/>
           </w:tcPr>
           <w:p>
@@ -5749,7 +5731,7 @@
         </w:tc>
         <w:tc>
           <w:tcPr>
-            <w:tcW w:type="dxa" w:w="1176"/>
+            <w:tcW w:type="dxa" w:w="1205"/>
             <w:shd w:val="clear" w:color="auto" w:fill="F5F0E8"/>
           </w:tcPr>
           <w:p>
@@ -5771,7 +5753,7 @@
         </w:tc>
         <w:tc>
           <w:tcPr>
-            <w:tcW w:type="dxa" w:w="1176"/>
+            <w:tcW w:type="dxa" w:w="1205"/>
             <w:shd w:val="clear" w:color="auto" w:fill="F5F0E8"/>
           </w:tcPr>
           <w:p>
@@ -5793,7 +5775,7 @@
         </w:tc>
         <w:tc>
           <w:tcPr>
-            <w:tcW w:type="dxa" w:w="1176"/>
+            <w:tcW w:type="dxa" w:w="1205"/>
             <w:shd w:val="clear" w:color="auto" w:fill="F5F0E8"/>
           </w:tcPr>
           <w:p>
@@ -5815,7 +5797,7 @@
         </w:tc>
         <w:tc>
           <w:tcPr>
-            <w:tcW w:type="dxa" w:w="1176"/>
+            <w:tcW w:type="dxa" w:w="1205"/>
             <w:shd w:val="clear" w:color="auto" w:fill="F5F0E8"/>
           </w:tcPr>
           <w:p>
@@ -5837,7 +5819,7 @@
         </w:tc>
         <w:tc>
           <w:tcPr>
-            <w:tcW w:type="dxa" w:w="1176"/>
+            <w:tcW w:type="dxa" w:w="1205"/>
             <w:shd w:val="clear" w:color="auto" w:fill="F5F0E8"/>
           </w:tcPr>
           <w:p>
@@ -5859,7 +5841,7 @@
         </w:tc>
         <w:tc>
           <w:tcPr>
-            <w:tcW w:type="dxa" w:w="1176"/>
+            <w:tcW w:type="dxa" w:w="1205"/>
             <w:shd w:val="clear" w:color="auto" w:fill="F5F0E8"/>
           </w:tcPr>
           <w:p>
@@ -5883,7 +5865,7 @@
       <w:tr>
         <w:tc>
           <w:tcPr>
-            <w:tcW w:type="dxa" w:w="1176"/>
+            <w:tcW w:type="dxa" w:w="1205"/>
             <w:shd w:val="clear" w:color="auto" w:fill="FFFFFF"/>
           </w:tcPr>
           <w:p>
@@ -5905,7 +5887,7 @@
         </w:tc>
         <w:tc>
           <w:tcPr>
-            <w:tcW w:type="dxa" w:w="1176"/>
+            <w:tcW w:type="dxa" w:w="1205"/>
             <w:shd w:val="clear" w:color="auto" w:fill="FFFFFF"/>
           </w:tcPr>
           <w:p>
@@ -5927,7 +5909,7 @@
         </w:tc>
         <w:tc>
           <w:tcPr>
-            <w:tcW w:type="dxa" w:w="1176"/>
+            <w:tcW w:type="dxa" w:w="1205"/>
             <w:shd w:val="clear" w:color="auto" w:fill="FFFFFF"/>
           </w:tcPr>
           <w:p>
@@ -5949,7 +5931,7 @@
         </w:tc>
         <w:tc>
           <w:tcPr>
-            <w:tcW w:type="dxa" w:w="1176"/>
+            <w:tcW w:type="dxa" w:w="1205"/>
             <w:shd w:val="clear" w:color="auto" w:fill="FFFFFF"/>
           </w:tcPr>
           <w:p>
@@ -5971,7 +5953,7 @@
         </w:tc>
         <w:tc>
           <w:tcPr>
-            <w:tcW w:type="dxa" w:w="1176"/>
+            <w:tcW w:type="dxa" w:w="1205"/>
             <w:shd w:val="clear" w:color="auto" w:fill="FFFFFF"/>
           </w:tcPr>
           <w:p>
@@ -5993,7 +5975,7 @@
         </w:tc>
         <w:tc>
           <w:tcPr>
-            <w:tcW w:type="dxa" w:w="1176"/>
+            <w:tcW w:type="dxa" w:w="1205"/>
             <w:shd w:val="clear" w:color="auto" w:fill="FFFFFF"/>
           </w:tcPr>
           <w:p>
@@ -6015,7 +5997,7 @@
         </w:tc>
         <w:tc>
           <w:tcPr>
-            <w:tcW w:type="dxa" w:w="1176"/>
+            <w:tcW w:type="dxa" w:w="1205"/>
             <w:shd w:val="clear" w:color="auto" w:fill="FFFFFF"/>
           </w:tcPr>
           <w:p>
@@ -6037,7 +6019,7 @@
         </w:tc>
         <w:tc>
           <w:tcPr>
-            <w:tcW w:type="dxa" w:w="1176"/>
+            <w:tcW w:type="dxa" w:w="1205"/>
             <w:shd w:val="clear" w:color="auto" w:fill="FFFFFF"/>
           </w:tcPr>
           <w:p>
@@ -6150,7 +6132,7 @@
           <w:i/>
           <w:sz w:val="22"/>
         </w:rPr>
-        <w:t>4.4. Feature Importance</w:t>
+        <w:t>3.4. Feature Importance</w:t>
       </w:r>
     </w:p>
     <w:p>
@@ -6176,15 +6158,15 @@
         <w:tblLook w:firstColumn="1" w:firstRow="1" w:lastColumn="0" w:lastRow="0" w:noHBand="0" w:noVBand="1" w:val="04A0"/>
       </w:tblPr>
       <w:tblGrid>
-        <w:gridCol w:w="2351"/>
-        <w:gridCol w:w="2351"/>
-        <w:gridCol w:w="2351"/>
-        <w:gridCol w:w="2351"/>
+        <w:gridCol w:w="2409"/>
+        <w:gridCol w:w="2409"/>
+        <w:gridCol w:w="2409"/>
+        <w:gridCol w:w="2409"/>
       </w:tblGrid>
       <w:tr>
         <w:tc>
           <w:tcPr>
-            <w:tcW w:type="dxa" w:w="2351"/>
+            <w:tcW w:type="dxa" w:w="2409"/>
             <w:shd w:val="clear" w:color="auto" w:fill="C99347"/>
           </w:tcPr>
           <w:p>
@@ -6206,7 +6188,7 @@
         </w:tc>
         <w:tc>
           <w:tcPr>
-            <w:tcW w:type="dxa" w:w="2351"/>
+            <w:tcW w:type="dxa" w:w="2409"/>
             <w:shd w:val="clear" w:color="auto" w:fill="C99347"/>
           </w:tcPr>
           <w:p>
@@ -6228,7 +6210,7 @@
         </w:tc>
         <w:tc>
           <w:tcPr>
-            <w:tcW w:type="dxa" w:w="2351"/>
+            <w:tcW w:type="dxa" w:w="2409"/>
             <w:shd w:val="clear" w:color="auto" w:fill="C99347"/>
           </w:tcPr>
           <w:p>
@@ -6250,7 +6232,7 @@
         </w:tc>
         <w:tc>
           <w:tcPr>
-            <w:tcW w:type="dxa" w:w="2351"/>
+            <w:tcW w:type="dxa" w:w="2409"/>
             <w:shd w:val="clear" w:color="auto" w:fill="C99347"/>
           </w:tcPr>
           <w:p>
@@ -6274,7 +6256,7 @@
       <w:tr>
         <w:tc>
           <w:tcPr>
-            <w:tcW w:type="dxa" w:w="2351"/>
+            <w:tcW w:type="dxa" w:w="2409"/>
             <w:shd w:val="clear" w:color="auto" w:fill="F5F0E8"/>
           </w:tcPr>
           <w:p>
@@ -6296,7 +6278,7 @@
         </w:tc>
         <w:tc>
           <w:tcPr>
-            <w:tcW w:type="dxa" w:w="2351"/>
+            <w:tcW w:type="dxa" w:w="2409"/>
             <w:shd w:val="clear" w:color="auto" w:fill="F5F0E8"/>
           </w:tcPr>
           <w:p>
@@ -6318,7 +6300,7 @@
         </w:tc>
         <w:tc>
           <w:tcPr>
-            <w:tcW w:type="dxa" w:w="2351"/>
+            <w:tcW w:type="dxa" w:w="2409"/>
             <w:shd w:val="clear" w:color="auto" w:fill="F5F0E8"/>
           </w:tcPr>
           <w:p>
@@ -6340,7 +6322,7 @@
         </w:tc>
         <w:tc>
           <w:tcPr>
-            <w:tcW w:type="dxa" w:w="2351"/>
+            <w:tcW w:type="dxa" w:w="2409"/>
             <w:shd w:val="clear" w:color="auto" w:fill="F5F0E8"/>
           </w:tcPr>
           <w:p>
@@ -6364,7 +6346,7 @@
       <w:tr>
         <w:tc>
           <w:tcPr>
-            <w:tcW w:type="dxa" w:w="2351"/>
+            <w:tcW w:type="dxa" w:w="2409"/>
             <w:shd w:val="clear" w:color="auto" w:fill="FFFFFF"/>
           </w:tcPr>
           <w:p>
@@ -6386,7 +6368,7 @@
         </w:tc>
         <w:tc>
           <w:tcPr>
-            <w:tcW w:type="dxa" w:w="2351"/>
+            <w:tcW w:type="dxa" w:w="2409"/>
             <w:shd w:val="clear" w:color="auto" w:fill="FFFFFF"/>
           </w:tcPr>
           <w:p>
@@ -6408,7 +6390,7 @@
         </w:tc>
         <w:tc>
           <w:tcPr>
-            <w:tcW w:type="dxa" w:w="2351"/>
+            <w:tcW w:type="dxa" w:w="2409"/>
             <w:shd w:val="clear" w:color="auto" w:fill="FFFFFF"/>
           </w:tcPr>
           <w:p>
@@ -6430,7 +6412,7 @@
         </w:tc>
         <w:tc>
           <w:tcPr>
-            <w:tcW w:type="dxa" w:w="2351"/>
+            <w:tcW w:type="dxa" w:w="2409"/>
             <w:shd w:val="clear" w:color="auto" w:fill="FFFFFF"/>
           </w:tcPr>
           <w:p>
@@ -6454,7 +6436,7 @@
       <w:tr>
         <w:tc>
           <w:tcPr>
-            <w:tcW w:type="dxa" w:w="2351"/>
+            <w:tcW w:type="dxa" w:w="2409"/>
             <w:shd w:val="clear" w:color="auto" w:fill="F5F0E8"/>
           </w:tcPr>
           <w:p>
@@ -6476,7 +6458,7 @@
         </w:tc>
         <w:tc>
           <w:tcPr>
-            <w:tcW w:type="dxa" w:w="2351"/>
+            <w:tcW w:type="dxa" w:w="2409"/>
             <w:shd w:val="clear" w:color="auto" w:fill="F5F0E8"/>
           </w:tcPr>
           <w:p>
@@ -6498,7 +6480,7 @@
         </w:tc>
         <w:tc>
           <w:tcPr>
-            <w:tcW w:type="dxa" w:w="2351"/>
+            <w:tcW w:type="dxa" w:w="2409"/>
             <w:shd w:val="clear" w:color="auto" w:fill="F5F0E8"/>
           </w:tcPr>
           <w:p>
@@ -6520,7 +6502,7 @@
         </w:tc>
         <w:tc>
           <w:tcPr>
-            <w:tcW w:type="dxa" w:w="2351"/>
+            <w:tcW w:type="dxa" w:w="2409"/>
             <w:shd w:val="clear" w:color="auto" w:fill="F5F0E8"/>
           </w:tcPr>
           <w:p>
@@ -6544,7 +6526,7 @@
       <w:tr>
         <w:tc>
           <w:tcPr>
-            <w:tcW w:type="dxa" w:w="2351"/>
+            <w:tcW w:type="dxa" w:w="2409"/>
             <w:shd w:val="clear" w:color="auto" w:fill="FFFFFF"/>
           </w:tcPr>
           <w:p>
@@ -6566,7 +6548,7 @@
         </w:tc>
         <w:tc>
           <w:tcPr>
-            <w:tcW w:type="dxa" w:w="2351"/>
+            <w:tcW w:type="dxa" w:w="2409"/>
             <w:shd w:val="clear" w:color="auto" w:fill="FFFFFF"/>
           </w:tcPr>
           <w:p>
@@ -6588,7 +6570,7 @@
         </w:tc>
         <w:tc>
           <w:tcPr>
-            <w:tcW w:type="dxa" w:w="2351"/>
+            <w:tcW w:type="dxa" w:w="2409"/>
             <w:shd w:val="clear" w:color="auto" w:fill="FFFFFF"/>
           </w:tcPr>
           <w:p>
@@ -6610,7 +6592,7 @@
         </w:tc>
         <w:tc>
           <w:tcPr>
-            <w:tcW w:type="dxa" w:w="2351"/>
+            <w:tcW w:type="dxa" w:w="2409"/>
             <w:shd w:val="clear" w:color="auto" w:fill="FFFFFF"/>
           </w:tcPr>
           <w:p>
@@ -6634,7 +6616,7 @@
       <w:tr>
         <w:tc>
           <w:tcPr>
-            <w:tcW w:type="dxa" w:w="2351"/>
+            <w:tcW w:type="dxa" w:w="2409"/>
             <w:shd w:val="clear" w:color="auto" w:fill="F5F0E8"/>
           </w:tcPr>
           <w:p>
@@ -6656,7 +6638,7 @@
         </w:tc>
         <w:tc>
           <w:tcPr>
-            <w:tcW w:type="dxa" w:w="2351"/>
+            <w:tcW w:type="dxa" w:w="2409"/>
             <w:shd w:val="clear" w:color="auto" w:fill="F5F0E8"/>
           </w:tcPr>
           <w:p>
@@ -6678,7 +6660,7 @@
         </w:tc>
         <w:tc>
           <w:tcPr>
-            <w:tcW w:type="dxa" w:w="2351"/>
+            <w:tcW w:type="dxa" w:w="2409"/>
             <w:shd w:val="clear" w:color="auto" w:fill="F5F0E8"/>
           </w:tcPr>
           <w:p>
@@ -6700,7 +6682,7 @@
         </w:tc>
         <w:tc>
           <w:tcPr>
-            <w:tcW w:type="dxa" w:w="2351"/>
+            <w:tcW w:type="dxa" w:w="2409"/>
             <w:shd w:val="clear" w:color="auto" w:fill="F5F0E8"/>
           </w:tcPr>
           <w:p>
@@ -6724,7 +6706,7 @@
       <w:tr>
         <w:tc>
           <w:tcPr>
-            <w:tcW w:type="dxa" w:w="2351"/>
+            <w:tcW w:type="dxa" w:w="2409"/>
             <w:shd w:val="clear" w:color="auto" w:fill="FFFFFF"/>
           </w:tcPr>
           <w:p>
@@ -6746,7 +6728,7 @@
         </w:tc>
         <w:tc>
           <w:tcPr>
-            <w:tcW w:type="dxa" w:w="2351"/>
+            <w:tcW w:type="dxa" w:w="2409"/>
             <w:shd w:val="clear" w:color="auto" w:fill="FFFFFF"/>
           </w:tcPr>
           <w:p>
@@ -6768,7 +6750,7 @@
         </w:tc>
         <w:tc>
           <w:tcPr>
-            <w:tcW w:type="dxa" w:w="2351"/>
+            <w:tcW w:type="dxa" w:w="2409"/>
             <w:shd w:val="clear" w:color="auto" w:fill="FFFFFF"/>
           </w:tcPr>
           <w:p>
@@ -6790,7 +6772,7 @@
         </w:tc>
         <w:tc>
           <w:tcPr>
-            <w:tcW w:type="dxa" w:w="2351"/>
+            <w:tcW w:type="dxa" w:w="2409"/>
             <w:shd w:val="clear" w:color="auto" w:fill="FFFFFF"/>
           </w:tcPr>
           <w:p>
@@ -6814,7 +6796,7 @@
       <w:tr>
         <w:tc>
           <w:tcPr>
-            <w:tcW w:type="dxa" w:w="2351"/>
+            <w:tcW w:type="dxa" w:w="2409"/>
             <w:shd w:val="clear" w:color="auto" w:fill="F5F0E8"/>
           </w:tcPr>
           <w:p>
@@ -6836,7 +6818,7 @@
         </w:tc>
         <w:tc>
           <w:tcPr>
-            <w:tcW w:type="dxa" w:w="2351"/>
+            <w:tcW w:type="dxa" w:w="2409"/>
             <w:shd w:val="clear" w:color="auto" w:fill="F5F0E8"/>
           </w:tcPr>
           <w:p>
@@ -6858,7 +6840,7 @@
         </w:tc>
         <w:tc>
           <w:tcPr>
-            <w:tcW w:type="dxa" w:w="2351"/>
+            <w:tcW w:type="dxa" w:w="2409"/>
             <w:shd w:val="clear" w:color="auto" w:fill="F5F0E8"/>
           </w:tcPr>
           <w:p>
@@ -6880,7 +6862,7 @@
         </w:tc>
         <w:tc>
           <w:tcPr>
-            <w:tcW w:type="dxa" w:w="2351"/>
+            <w:tcW w:type="dxa" w:w="2409"/>
             <w:shd w:val="clear" w:color="auto" w:fill="F5F0E8"/>
           </w:tcPr>
           <w:p>
@@ -6904,7 +6886,7 @@
       <w:tr>
         <w:tc>
           <w:tcPr>
-            <w:tcW w:type="dxa" w:w="2351"/>
+            <w:tcW w:type="dxa" w:w="2409"/>
             <w:shd w:val="clear" w:color="auto" w:fill="FFFFFF"/>
           </w:tcPr>
           <w:p>
@@ -6926,7 +6908,7 @@
         </w:tc>
         <w:tc>
           <w:tcPr>
-            <w:tcW w:type="dxa" w:w="2351"/>
+            <w:tcW w:type="dxa" w:w="2409"/>
             <w:shd w:val="clear" w:color="auto" w:fill="FFFFFF"/>
           </w:tcPr>
           <w:p>
@@ -6948,7 +6930,7 @@
         </w:tc>
         <w:tc>
           <w:tcPr>
-            <w:tcW w:type="dxa" w:w="2351"/>
+            <w:tcW w:type="dxa" w:w="2409"/>
             <w:shd w:val="clear" w:color="auto" w:fill="FFFFFF"/>
           </w:tcPr>
           <w:p>
@@ -6970,7 +6952,7 @@
         </w:tc>
         <w:tc>
           <w:tcPr>
-            <w:tcW w:type="dxa" w:w="2351"/>
+            <w:tcW w:type="dxa" w:w="2409"/>
             <w:shd w:val="clear" w:color="auto" w:fill="FFFFFF"/>
           </w:tcPr>
           <w:p>
@@ -6994,7 +6976,7 @@
       <w:tr>
         <w:tc>
           <w:tcPr>
-            <w:tcW w:type="dxa" w:w="2351"/>
+            <w:tcW w:type="dxa" w:w="2409"/>
             <w:shd w:val="clear" w:color="auto" w:fill="F5F0E8"/>
           </w:tcPr>
           <w:p>
@@ -7016,7 +6998,7 @@
         </w:tc>
         <w:tc>
           <w:tcPr>
-            <w:tcW w:type="dxa" w:w="2351"/>
+            <w:tcW w:type="dxa" w:w="2409"/>
             <w:shd w:val="clear" w:color="auto" w:fill="F5F0E8"/>
           </w:tcPr>
           <w:p>
@@ -7038,7 +7020,7 @@
         </w:tc>
         <w:tc>
           <w:tcPr>
-            <w:tcW w:type="dxa" w:w="2351"/>
+            <w:tcW w:type="dxa" w:w="2409"/>
             <w:shd w:val="clear" w:color="auto" w:fill="F5F0E8"/>
           </w:tcPr>
           <w:p>
@@ -7060,7 +7042,7 @@
         </w:tc>
         <w:tc>
           <w:tcPr>
-            <w:tcW w:type="dxa" w:w="2351"/>
+            <w:tcW w:type="dxa" w:w="2409"/>
             <w:shd w:val="clear" w:color="auto" w:fill="F5F0E8"/>
           </w:tcPr>
           <w:p>
@@ -7084,7 +7066,7 @@
       <w:tr>
         <w:tc>
           <w:tcPr>
-            <w:tcW w:type="dxa" w:w="2351"/>
+            <w:tcW w:type="dxa" w:w="2409"/>
             <w:shd w:val="clear" w:color="auto" w:fill="FFFFFF"/>
           </w:tcPr>
           <w:p>
@@ -7106,7 +7088,7 @@
         </w:tc>
         <w:tc>
           <w:tcPr>
-            <w:tcW w:type="dxa" w:w="2351"/>
+            <w:tcW w:type="dxa" w:w="2409"/>
             <w:shd w:val="clear" w:color="auto" w:fill="FFFFFF"/>
           </w:tcPr>
           <w:p>
@@ -7128,7 +7110,7 @@
         </w:tc>
         <w:tc>
           <w:tcPr>
-            <w:tcW w:type="dxa" w:w="2351"/>
+            <w:tcW w:type="dxa" w:w="2409"/>
             <w:shd w:val="clear" w:color="auto" w:fill="FFFFFF"/>
           </w:tcPr>
           <w:p>
@@ -7150,7 +7132,7 @@
         </w:tc>
         <w:tc>
           <w:tcPr>
-            <w:tcW w:type="dxa" w:w="2351"/>
+            <w:tcW w:type="dxa" w:w="2409"/>
             <w:shd w:val="clear" w:color="auto" w:fill="FFFFFF"/>
           </w:tcPr>
           <w:p>
@@ -7322,7 +7304,7 @@
           <w:i/>
           <w:sz w:val="22"/>
         </w:rPr>
-        <w:t>4.5. Confusion, Score Distribution and Calibration</w:t>
+        <w:t>3.5. Confusion, Score Distribution and Calibration</w:t>
       </w:r>
     </w:p>
     <w:p>
@@ -7653,7 +7635,7 @@
           <w:i/>
           <w:sz w:val="22"/>
         </w:rPr>
-        <w:t>4.6. Threshold Sweep and Decision Operating Points</w:t>
+        <w:t>3.6. Threshold Sweep and Decision Operating Points</w:t>
       </w:r>
     </w:p>
     <w:p>
@@ -7746,7 +7728,7 @@
           <w:i/>
           <w:sz w:val="22"/>
         </w:rPr>
-        <w:t>4.7. Per-Generator Performance</w:t>
+        <w:t>3.7. Per-Generator Performance</w:t>
       </w:r>
     </w:p>
     <w:p>
@@ -7886,24 +7868,6 @@
     <w:p>
       <w:pPr>
         <w:jc w:val="left"/>
-        <w:spacing w:before="280" w:after="120" w:line="240" w:lineRule="auto"/>
-        <w:keepNext/>
-        <w:keepLines/>
-      </w:pPr>
-      <w:r>
-        <w:rPr>
-          <w:rFonts w:ascii="Times New Roman" w:hAnsi="Times New Roman" w:cs="Times New Roman"/>
-          <w:rFonts w:ascii="Times New Roman" w:hAnsi="Times New Roman"/>
-          <w:b/>
-          <w:i w:val="0"/>
-          <w:sz w:val="22"/>
-        </w:rPr>
-        <w:t>5. DISCUSSION</w:t>
-      </w:r>
-    </w:p>
-    <w:p>
-      <w:pPr>
-        <w:jc w:val="left"/>
         <w:spacing w:before="200" w:after="80" w:line="240" w:lineRule="auto"/>
         <w:keepNext/>
         <w:keepLines/>
@@ -7916,7 +7880,7 @@
           <w:i/>
           <w:sz w:val="22"/>
         </w:rPr>
-        <w:t>5.1. Why Spectral Flatness Dominates</w:t>
+        <w:t>3.8. Why Spectral Flatness Dominates</w:t>
       </w:r>
     </w:p>
     <w:p>
@@ -7950,7 +7914,7 @@
           <w:i/>
           <w:sz w:val="22"/>
         </w:rPr>
-        <w:t>5.2. Cross-Generator Generalisation</w:t>
+        <w:t>3.9. Cross-Generator Generalisation</w:t>
       </w:r>
     </w:p>
     <w:p>
@@ -7984,7 +7948,7 @@
           <w:i/>
           <w:sz w:val="22"/>
         </w:rPr>
-        <w:t>5.3. Why the 1D-CNN Underperforms</w:t>
+        <w:t>3.10. Why the 1D-CNN Underperforms</w:t>
       </w:r>
     </w:p>
     <w:p>
@@ -8018,7 +7982,7 @@
           <w:i/>
           <w:sz w:val="22"/>
         </w:rPr>
-        <w:t>5.4. Calibration and Operational Utility</w:t>
+        <w:t>3.11. Calibration and Operational Utility</w:t>
       </w:r>
     </w:p>
     <w:p>
@@ -8052,7 +8016,7 @@
           <w:i/>
           <w:sz w:val="22"/>
         </w:rPr>
-        <w:t>5.5. Overfit Diagnosis</w:t>
+        <w:t>3.12. Overfit Diagnosis</w:t>
       </w:r>
     </w:p>
     <w:p>
@@ -8145,7 +8109,7 @@
           <w:i/>
           <w:sz w:val="22"/>
         </w:rPr>
-        <w:t>5.6. Feature Redundancy</w:t>
+        <w:t>3.13. Feature Redundancy</w:t>
       </w:r>
     </w:p>
     <w:p>
@@ -8238,7 +8202,7 @@
           <w:i/>
           <w:sz w:val="22"/>
         </w:rPr>
-        <w:t>5.7. How Many Features Are Actually Needed?</w:t>
+        <w:t>3.14. How Many Features Are Actually Needed?</w:t>
       </w:r>
     </w:p>
     <w:p>
@@ -8331,7 +8295,7 @@
           <w:i/>
           <w:sz w:val="22"/>
         </w:rPr>
-        <w:t>5.8. Limitations</w:t>
+        <w:t>3.15. Limitations</w:t>
       </w:r>
     </w:p>
     <w:p>
@@ -8365,7 +8329,7 @@
           <w:i w:val="0"/>
           <w:sz w:val="22"/>
         </w:rPr>
-        <w:t>6. CONCLUSION</w:t>
+        <w:t>4. CONCLUSION</w:t>
       </w:r>
     </w:p>
     <w:p>
@@ -8381,7 +8345,7 @@
           <w:i w:val="0"/>
           <w:sz w:val="22"/>
         </w:rPr>
-        <w:t>This paper has presented AURIS, an end-to-end system for detecting AI-generated music that combines a 47-dimensional handcrafted acoustic feature vector with an ensemble of eleven classification models trained on 5,195 samples drawn from twelve or more AI generation systems. The principal empirical findings are as follows. LightGBM achieves the highest mean ROC-AUC at 0.9549, narrowly ahead of Deep MLP at 0.9537. Spectral flatness is the single most informative feature for the AI-versus-human distinction, a pattern that is interpretable in terms of the difference between synthetic and recorded spectra. Per-fold Youden's J threshold optimisation systematically outperforms the default 0.5 cutoff under the present 1:1.5 class imbalance, and the resulting model is well calibrated, with a Brier score of 0.083 on the aggregated validation predictions.</w:t>
+        <w:t>This paper has presented AURIS, an end-to-end system for detecting AI-generated music that combines a 47-dimensional handcrafted acoustic feature vector with an ensemble of eleven classification models trained on 5,195 samples drawn from twelve or more AI generation systems. The principal empirical findings are as follows. LightGBM achieves the highest mean ROC-AUC at 0.9548, narrowly ahead of Deep MLP at 0.9542, and also the lowest fold-to-fold variance (±0.0023). Spectral flatness is the single most informative feature for the AI-versus-human distinction, a pattern that is interpretable in terms of the difference between synthetic and recorded spectra. Per-fold Youden's J threshold optimisation systematically outperforms the default 0.5 cutoff under the present 1:1.5 class imbalance, and the resulting model is well calibrated, with a Brier score of 0.083 on the aggregated validation predictions. Two limitations are made explicit by the diagnostic analysis: every tree ensemble shows an 8-14 percentage-point gap between training and cross-validation accuracy, and the feature ablation shows that the bottom seventeen of the 47 features add no measurable accuracy.</w:t>
       </w:r>
     </w:p>
     <w:p>
@@ -8398,6 +8362,40 @@
           <w:sz w:val="22"/>
         </w:rPr>
         <w:t>Future work will pursue four directions. First, a formal cross-generator held-out evaluation will be conducted on emerging public benchmarks such as SONICS and FakeMusicCaps. Second, the fine-tuned wav2vec2 model will be integrated into the 5-fold cross-validation protocol for a direct comparison with the feature-based classifiers. Third, adversarial robustness will be evaluated explicitly under MP3 compression, pitch shifting and time-stretching. Fourth, the dataset will be expanded toward ten thousand samples and updated to include emerging generation systems as they appear, with particular attention to the cross-generator generalisation challenge identified by Li et al. (2024).</w:t>
+      </w:r>
+    </w:p>
+    <w:p>
+      <w:pPr>
+        <w:jc w:val="left"/>
+        <w:spacing w:before="280" w:after="120" w:line="240" w:lineRule="auto"/>
+        <w:keepNext/>
+        <w:keepLines/>
+      </w:pPr>
+      <w:r>
+        <w:rPr>
+          <w:rFonts w:ascii="Times New Roman" w:hAnsi="Times New Roman" w:cs="Times New Roman"/>
+          <w:rFonts w:ascii="Times New Roman" w:hAnsi="Times New Roman"/>
+          <w:b/>
+          <w:i w:val="0"/>
+          <w:sz w:val="22"/>
+        </w:rPr>
+        <w:t>AI DISCLOSURE</w:t>
+      </w:r>
+    </w:p>
+    <w:p>
+      <w:pPr>
+        <w:jc w:val="both"/>
+        <w:spacing w:before="80" w:after="160" w:line="240" w:lineRule="auto"/>
+      </w:pPr>
+      <w:r>
+        <w:rPr>
+          <w:rFonts w:ascii="Times New Roman" w:hAnsi="Times New Roman" w:cs="Times New Roman"/>
+          <w:rFonts w:ascii="Times New Roman" w:hAnsi="Times New Roman"/>
+          <w:b w:val="0"/>
+          <w:i w:val="0"/>
+          <w:sz w:val="22"/>
+        </w:rPr>
+        <w:t>Generative AI was used as an assistive tool for language editing and for parts of the figure and analysis code. All data, trained models and experimental results are the author's own, and every reported value was verified against the underlying data. The author takes full responsibility for the integrity and accuracy of all content.</w:t>
       </w:r>
     </w:p>
     <w:p>
@@ -8794,8 +8792,8 @@
       </w:r>
     </w:p>
     <w:sectPr>
-      <w:pgSz w:w="12240" w:h="15840"/>
-      <w:pgMar w:top="1417" w:right="1417" w:bottom="1417" w:left="1417" w:header="720" w:footer="720" w:gutter="0"/>
+      <w:pgSz w:w="11906" w:h="16838"/>
+      <w:pgMar w:top="1701" w:right="1134" w:bottom="1134" w:left="1134" w:header="720" w:footer="720" w:gutter="0"/>
       <w:cols w:space="720"/>
       <w:docGrid w:linePitch="360"/>
     </w:sectPr>

</xml_diff>